<commit_message>
Modif dans le cahier des charges
</commit_message>
<xml_diff>
--- a/cahier des charges WebGestion.docx
+++ b/cahier des charges WebGestion.docx
@@ -22,13 +22,22 @@
           <w:b/>
           <w:bCs/>
         </w:rPr>
-        <w:t xml:space="preserve"> Cahier des Charges – WinGestion</w:t>
-      </w:r>
+        <w:t xml:space="preserve"> Cahier des Charges – </w:t>
+      </w:r>
+      <w:proofErr w:type="spellStart"/>
+      <w:r>
+        <w:rPr>
+          <w:b/>
+          <w:bCs/>
+        </w:rPr>
+        <w:t>WebGestion</w:t>
+      </w:r>
+      <w:proofErr w:type="spellEnd"/>
     </w:p>
     <w:p>
       <w:r>
-        <w:pict w14:anchorId="35BCA428">
-          <v:rect id="_x0000_i1169" style="width:0;height:1.5pt" o:hralign="center" o:hrstd="t" o:hr="t" fillcolor="#a0a0a0" stroked="f"/>
+        <w:pict w14:anchorId="3FC4BEC6">
+          <v:rect id="_x0000_i1097" style="width:0;height:1.5pt" o:hralign="center" o:hrstd="t" o:hr="t" fillcolor="#a0a0a0" stroked="f"/>
         </w:pict>
       </w:r>
     </w:p>
@@ -56,8 +65,13 @@
         <w:t>Nom du projet</w:t>
       </w:r>
       <w:r>
-        <w:t xml:space="preserve"> : WinGestion</w:t>
-      </w:r>
+        <w:t xml:space="preserve"> : </w:t>
+      </w:r>
+      <w:proofErr w:type="spellStart"/>
+      <w:r>
+        <w:t>WebGestion</w:t>
+      </w:r>
+      <w:proofErr w:type="spellEnd"/>
       <w:r>
         <w:br/>
       </w:r>
@@ -69,7 +83,7 @@
         <w:t>Type d’application</w:t>
       </w:r>
       <w:r>
-        <w:t xml:space="preserve"> : Logiciel de facturation et de gestion commerciale</w:t>
+        <w:t xml:space="preserve"> : Application web de facturation et de gestion commerciale</w:t>
       </w:r>
       <w:r>
         <w:br/>
@@ -82,7 +96,15 @@
         <w:t>Architecture</w:t>
       </w:r>
       <w:r>
-        <w:t xml:space="preserve"> : Client lourd (développé en WinDev)</w:t>
+        <w:t xml:space="preserve"> : Client léger (développé en </w:t>
+      </w:r>
+      <w:proofErr w:type="spellStart"/>
+      <w:r>
+        <w:t>Laravel</w:t>
+      </w:r>
+      <w:proofErr w:type="spellEnd"/>
+      <w:r>
+        <w:t>)</w:t>
       </w:r>
       <w:r>
         <w:br/>
@@ -121,13 +143,32 @@
         <w:t>facturation électronique obligatoire</w:t>
       </w:r>
       <w:r>
-        <w:t xml:space="preserve"> (2026-2027) impose aux entreprises de moderniser leurs outils. WinGestion a pour ambition de fournir une solution simple, ergonomique et économique permettant de gérer la facturation, les paiements, les stocks et la comptabilité de manière efficace.</w:t>
+        <w:t xml:space="preserve"> (2026-2027) incite les entreprises à adopter des solutions numériques accessibles partout.</w:t>
+      </w:r>
+      <w:r>
+        <w:br/>
+      </w:r>
+      <w:proofErr w:type="spellStart"/>
+      <w:r>
+        <w:t>WebGestion</w:t>
+      </w:r>
+      <w:proofErr w:type="spellEnd"/>
+      <w:r>
+        <w:t xml:space="preserve"> vise à offrir une alternative en ligne au logiciel </w:t>
+      </w:r>
+      <w:proofErr w:type="spellStart"/>
+      <w:r>
+        <w:t>WinGestion</w:t>
+      </w:r>
+      <w:proofErr w:type="spellEnd"/>
+      <w:r>
+        <w:t xml:space="preserve"> (client lourd), afin de permettre aux utilisateurs de gérer leurs factures, devis, paiements, stocks et documents directement depuis un navigateur, sans installation locale.</w:t>
       </w:r>
     </w:p>
     <w:p>
       <w:r>
-        <w:pict w14:anchorId="20F264E1">
-          <v:rect id="_x0000_i1170" style="width:0;height:1.5pt" o:hralign="center" o:hrstd="t" o:hr="t" fillcolor="#a0a0a0" stroked="f"/>
+        <w:pict w14:anchorId="79D7828D">
+          <v:rect id="_x0000_i1098" style="width:0;height:1.5pt" o:hralign="center" o:hrstd="t" o:hr="t" fillcolor="#a0a0a0" stroked="f"/>
         </w:pict>
       </w:r>
     </w:p>
@@ -150,122 +191,99 @@
       <w:pPr>
         <w:numPr>
           <w:ilvl w:val="0"/>
-          <w:numId w:val="18"/>
+          <w:numId w:val="34"/>
         </w:numPr>
       </w:pPr>
       <w:r>
-        <w:t xml:space="preserve">Gérer facilement les </w:t>
+        <w:t xml:space="preserve">Proposer une solution de facturation </w:t>
       </w:r>
       <w:r>
         <w:rPr>
           <w:b/>
           <w:bCs/>
         </w:rPr>
-        <w:t>clients, produits, services et factures</w:t>
-      </w:r>
-      <w:r>
-        <w:t>.</w:t>
+        <w:t>accessible en ligne</w:t>
+      </w:r>
+      <w:r>
+        <w:t xml:space="preserve"> depuis tout appareil (PC, tablette, smartphone).</w:t>
       </w:r>
     </w:p>
     <w:p>
       <w:pPr>
         <w:numPr>
           <w:ilvl w:val="0"/>
-          <w:numId w:val="18"/>
+          <w:numId w:val="34"/>
         </w:numPr>
       </w:pPr>
       <w:r>
-        <w:t>Automatiser la génération de documents (devis, commandes, factures, factures d’acompte, avoirs, bons de livraison).</w:t>
+        <w:t xml:space="preserve">Offrir les mêmes fonctionnalités que </w:t>
+      </w:r>
+      <w:proofErr w:type="spellStart"/>
+      <w:r>
+        <w:t>WinGestion</w:t>
+      </w:r>
+      <w:proofErr w:type="spellEnd"/>
+      <w:r>
+        <w:t xml:space="preserve"> (facturation, suivi des paiements, gestion des stocks, statistiques, comptabilité simplifiée).</w:t>
       </w:r>
     </w:p>
     <w:p>
       <w:pPr>
         <w:numPr>
           <w:ilvl w:val="0"/>
-          <w:numId w:val="18"/>
+          <w:numId w:val="34"/>
         </w:numPr>
       </w:pPr>
       <w:r>
-        <w:t xml:space="preserve">Assurer un </w:t>
+        <w:t>Faciliter la collaboration (multi-utilisateurs, gestion des rôles).</w:t>
+      </w:r>
+    </w:p>
+    <w:p>
+      <w:pPr>
+        <w:numPr>
+          <w:ilvl w:val="0"/>
+          <w:numId w:val="34"/>
+        </w:numPr>
+      </w:pPr>
+      <w:r>
+        <w:t xml:space="preserve">Garantir la </w:t>
       </w:r>
       <w:r>
         <w:rPr>
           <w:b/>
           <w:bCs/>
         </w:rPr>
-        <w:t>suivi précis des paiements</w:t>
-      </w:r>
-      <w:r>
-        <w:t xml:space="preserve"> (réglés, en attente, en retard, tranches).</w:t>
+        <w:t>sécurité des données</w:t>
+      </w:r>
+      <w:r>
+        <w:t xml:space="preserve"> (authentification, sauvegardes).</w:t>
       </w:r>
     </w:p>
     <w:p>
       <w:pPr>
         <w:numPr>
           <w:ilvl w:val="0"/>
-          <w:numId w:val="18"/>
+          <w:numId w:val="34"/>
         </w:numPr>
       </w:pPr>
       <w:r>
-        <w:t xml:space="preserve">Offrir un </w:t>
+        <w:t xml:space="preserve">Préparer l’intégration avec le </w:t>
       </w:r>
       <w:r>
         <w:rPr>
           <w:b/>
           <w:bCs/>
         </w:rPr>
-        <w:t>tableau de bord clair</w:t>
-      </w:r>
-      <w:r>
-        <w:t xml:space="preserve"> avec indicateurs (CA, impayés, top clients, ventes par produit).</w:t>
+        <w:t>Portail Public de Facturation (PPF)</w:t>
+      </w:r>
+      <w:r>
+        <w:t>.</w:t>
       </w:r>
     </w:p>
     <w:p>
-      <w:pPr>
-        <w:numPr>
-          <w:ilvl w:val="0"/>
-          <w:numId w:val="18"/>
-        </w:numPr>
-      </w:pPr>
-      <w:r>
-        <w:t xml:space="preserve">Intégrer un </w:t>
-      </w:r>
-      <w:r>
-        <w:rPr>
-          <w:b/>
-          <w:bCs/>
-        </w:rPr>
-        <w:t>module de gestion des stocks</w:t>
-      </w:r>
-      <w:r>
-        <w:t xml:space="preserve"> et un volet comptable simplifié.</w:t>
-      </w:r>
-    </w:p>
-    <w:p>
-      <w:pPr>
-        <w:numPr>
-          <w:ilvl w:val="0"/>
-          <w:numId w:val="18"/>
-        </w:numPr>
-      </w:pPr>
-      <w:r>
-        <w:t xml:space="preserve">Préparer la compatibilité avec la </w:t>
-      </w:r>
-      <w:r>
-        <w:rPr>
-          <w:b/>
-          <w:bCs/>
-        </w:rPr>
-        <w:t>facturation électronique obligatoire</w:t>
-      </w:r>
-      <w:r>
-        <w:t>.</w:t>
-      </w:r>
-    </w:p>
-    <w:p>
-      <w:r>
-        <w:pict w14:anchorId="0E14D71F">
-          <v:rect id="_x0000_i1171" style="width:0;height:1.5pt" o:hralign="center" o:hrstd="t" o:hr="t" fillcolor="#a0a0a0" stroked="f"/>
+      <w:r>
+        <w:pict w14:anchorId="5BB84625">
+          <v:rect id="_x0000_i1099" style="width:0;height:1.5pt" o:hralign="center" o:hrstd="t" o:hr="t" fillcolor="#a0a0a0" stroked="f"/>
         </w:pict>
       </w:r>
     </w:p>
@@ -303,22 +321,22 @@
       <w:pPr>
         <w:numPr>
           <w:ilvl w:val="0"/>
-          <w:numId w:val="19"/>
+          <w:numId w:val="35"/>
         </w:numPr>
       </w:pPr>
       <w:r>
-        <w:t>Connexion sécurisée par identifiant et mot de passe.</w:t>
+        <w:t>Authentification sécurisée (login/mot de passe).</w:t>
       </w:r>
     </w:p>
     <w:p>
       <w:pPr>
         <w:numPr>
           <w:ilvl w:val="0"/>
-          <w:numId w:val="19"/>
+          <w:numId w:val="35"/>
         </w:numPr>
       </w:pPr>
       <w:r>
-        <w:t>Gestion des rôles et droits (administrateur, utilisateur).</w:t>
+        <w:t>Gestion des rôles et droits d’accès (administrateur, utilisateur).</w:t>
       </w:r>
     </w:p>
     <w:p>
@@ -340,46 +358,40 @@
       <w:pPr>
         <w:numPr>
           <w:ilvl w:val="0"/>
-          <w:numId w:val="20"/>
+          <w:numId w:val="36"/>
         </w:numPr>
       </w:pPr>
       <w:r>
-        <w:t>CRUD (ajout, modification, suppression, consultation</w:t>
-      </w:r>
-      <w:r>
-        <w:t xml:space="preserve"> fiche client</w:t>
-      </w:r>
-      <w:r>
-        <w:t>).</w:t>
+        <w:t>CRUD (ajout, modification, suppression, consultation).</w:t>
       </w:r>
     </w:p>
     <w:p>
       <w:pPr>
         <w:numPr>
           <w:ilvl w:val="0"/>
-          <w:numId w:val="20"/>
+          <w:numId w:val="36"/>
         </w:numPr>
       </w:pPr>
       <w:r>
-        <w:t>Recherche et filtrage (nom, société, email).</w:t>
+        <w:t>Recherche et filtres (nom, société, email).</w:t>
       </w:r>
     </w:p>
     <w:p>
       <w:pPr>
         <w:numPr>
           <w:ilvl w:val="0"/>
-          <w:numId w:val="20"/>
+          <w:numId w:val="36"/>
         </w:numPr>
       </w:pPr>
       <w:r>
-        <w:t>Import et gestion de documents liés (GED).</w:t>
+        <w:t>Import de documents propres à chaque client (GED).</w:t>
       </w:r>
     </w:p>
     <w:p>
       <w:pPr>
         <w:numPr>
           <w:ilvl w:val="0"/>
-          <w:numId w:val="20"/>
+          <w:numId w:val="36"/>
         </w:numPr>
       </w:pPr>
       <w:r>
@@ -405,7 +417,7 @@
       <w:pPr>
         <w:numPr>
           <w:ilvl w:val="0"/>
-          <w:numId w:val="21"/>
+          <w:numId w:val="37"/>
         </w:numPr>
       </w:pPr>
       <w:r>
@@ -416,7 +428,7 @@
       <w:pPr>
         <w:numPr>
           <w:ilvl w:val="0"/>
-          <w:numId w:val="21"/>
+          <w:numId w:val="37"/>
         </w:numPr>
       </w:pPr>
       <w:r>
@@ -443,18 +455,18 @@
       <w:pPr>
         <w:numPr>
           <w:ilvl w:val="0"/>
-          <w:numId w:val="22"/>
+          <w:numId w:val="38"/>
         </w:numPr>
       </w:pPr>
       <w:r>
-        <w:t>Approvisionnement et retraits avec contrôle.</w:t>
+        <w:t>Approvisionnements et retraits avec contrôle.</w:t>
       </w:r>
     </w:p>
     <w:p>
       <w:pPr>
         <w:numPr>
           <w:ilvl w:val="0"/>
-          <w:numId w:val="22"/>
+          <w:numId w:val="38"/>
         </w:numPr>
       </w:pPr>
       <w:r>
@@ -465,7 +477,7 @@
       <w:pPr>
         <w:numPr>
           <w:ilvl w:val="0"/>
-          <w:numId w:val="22"/>
+          <w:numId w:val="38"/>
         </w:numPr>
       </w:pPr>
       <w:r>
@@ -476,7 +488,7 @@
       <w:pPr>
         <w:numPr>
           <w:ilvl w:val="0"/>
-          <w:numId w:val="22"/>
+          <w:numId w:val="38"/>
         </w:numPr>
       </w:pPr>
       <w:r>
@@ -502,7 +514,7 @@
       <w:pPr>
         <w:numPr>
           <w:ilvl w:val="0"/>
-          <w:numId w:val="23"/>
+          <w:numId w:val="39"/>
         </w:numPr>
       </w:pPr>
       <w:r>
@@ -513,18 +525,18 @@
       <w:pPr>
         <w:numPr>
           <w:ilvl w:val="0"/>
-          <w:numId w:val="23"/>
+          <w:numId w:val="39"/>
         </w:numPr>
       </w:pPr>
       <w:r>
-        <w:t>Transformation automatique (ex. devis → commande → facture).</w:t>
+        <w:t>Transformation automatique (devis → commande → facture).</w:t>
       </w:r>
     </w:p>
     <w:p>
       <w:pPr>
         <w:numPr>
           <w:ilvl w:val="0"/>
-          <w:numId w:val="23"/>
+          <w:numId w:val="39"/>
         </w:numPr>
       </w:pPr>
       <w:r>
@@ -535,29 +547,29 @@
       <w:pPr>
         <w:numPr>
           <w:ilvl w:val="0"/>
-          <w:numId w:val="23"/>
+          <w:numId w:val="39"/>
         </w:numPr>
       </w:pPr>
       <w:r>
-        <w:t>Calculs automatiques (HT, TVA, TTC).</w:t>
+        <w:t>Calculs HT / TVA / TTC automatiques.</w:t>
       </w:r>
     </w:p>
     <w:p>
       <w:pPr>
         <w:numPr>
           <w:ilvl w:val="0"/>
-          <w:numId w:val="23"/>
+          <w:numId w:val="39"/>
         </w:numPr>
       </w:pPr>
       <w:r>
-        <w:t>Gestion des tranches (spécifique bâtiment).</w:t>
+        <w:t>Gestion des tranches (bâtiment).</w:t>
       </w:r>
     </w:p>
     <w:p>
       <w:pPr>
         <w:numPr>
           <w:ilvl w:val="0"/>
-          <w:numId w:val="23"/>
+          <w:numId w:val="39"/>
         </w:numPr>
       </w:pPr>
       <w:r>
@@ -568,22 +580,22 @@
       <w:pPr>
         <w:numPr>
           <w:ilvl w:val="0"/>
-          <w:numId w:val="23"/>
+          <w:numId w:val="39"/>
         </w:numPr>
       </w:pPr>
       <w:r>
-        <w:t>Export comptable et PDF personnalisé (logo, mentions légales).</w:t>
+        <w:t>Export PDF (logo, mentions légales).</w:t>
       </w:r>
     </w:p>
     <w:p>
       <w:pPr>
         <w:numPr>
           <w:ilvl w:val="0"/>
-          <w:numId w:val="23"/>
+          <w:numId w:val="39"/>
         </w:numPr>
       </w:pPr>
       <w:r>
-        <w:t>Possibilité d’impression et d’envoi par mail des différents documents</w:t>
+        <w:t>Export vers la comptabilité.</w:t>
       </w:r>
     </w:p>
     <w:p>
@@ -605,7 +617,7 @@
       <w:pPr>
         <w:numPr>
           <w:ilvl w:val="0"/>
-          <w:numId w:val="24"/>
+          <w:numId w:val="40"/>
         </w:numPr>
       </w:pPr>
       <w:r>
@@ -616,14 +628,14 @@
       <w:pPr>
         <w:numPr>
           <w:ilvl w:val="0"/>
-          <w:numId w:val="24"/>
+          <w:numId w:val="40"/>
         </w:numPr>
       </w:pPr>
       <w:r>
         <w:t>Multi-règlements possibles sur un même document</w:t>
       </w:r>
       <w:r>
-        <w:t xml:space="preserve"> (cas des tranches).</w:t>
+        <w:t xml:space="preserve"> (tranches).</w:t>
       </w:r>
     </w:p>
     <w:p>
@@ -645,7 +657,7 @@
       <w:pPr>
         <w:numPr>
           <w:ilvl w:val="0"/>
-          <w:numId w:val="25"/>
+          <w:numId w:val="41"/>
         </w:numPr>
       </w:pPr>
       <w:r>
@@ -656,11 +668,11 @@
       <w:pPr>
         <w:numPr>
           <w:ilvl w:val="0"/>
-          <w:numId w:val="25"/>
+          <w:numId w:val="41"/>
         </w:numPr>
       </w:pPr>
       <w:r>
-        <w:t>Suivi des débits/crédits.</w:t>
+        <w:t>Suivi débit/crédit.</w:t>
       </w:r>
     </w:p>
     <w:p>
@@ -675,14 +687,14 @@
           <w:b/>
           <w:bCs/>
         </w:rPr>
-        <w:t>3.8 Statistiques &amp; reporting</w:t>
+        <w:t xml:space="preserve">3.8 Statistiques </w:t>
       </w:r>
     </w:p>
     <w:p>
       <w:pPr>
         <w:numPr>
           <w:ilvl w:val="0"/>
-          <w:numId w:val="26"/>
+          <w:numId w:val="42"/>
         </w:numPr>
       </w:pPr>
       <w:r>
@@ -693,11 +705,22 @@
       <w:pPr>
         <w:numPr>
           <w:ilvl w:val="0"/>
-          <w:numId w:val="26"/>
+          <w:numId w:val="42"/>
         </w:numPr>
       </w:pPr>
       <w:r>
-        <w:t>Suivi des ventes par produit, devis acceptés/refusés.</w:t>
+        <w:t>Suivi des ventes par produit.</w:t>
+      </w:r>
+    </w:p>
+    <w:p>
+      <w:pPr>
+        <w:numPr>
+          <w:ilvl w:val="0"/>
+          <w:numId w:val="42"/>
+        </w:numPr>
+      </w:pPr>
+      <w:r>
+        <w:t>Suivi des devis acceptés/refusés.</w:t>
       </w:r>
     </w:p>
     <w:p>
@@ -719,7 +742,7 @@
       <w:pPr>
         <w:numPr>
           <w:ilvl w:val="0"/>
-          <w:numId w:val="27"/>
+          <w:numId w:val="43"/>
         </w:numPr>
       </w:pPr>
       <w:r>
@@ -730,62 +753,84 @@
       <w:pPr>
         <w:numPr>
           <w:ilvl w:val="0"/>
-          <w:numId w:val="27"/>
+          <w:numId w:val="43"/>
         </w:numPr>
       </w:pPr>
       <w:r>
-        <w:t>Logo personnalisé et mentions légales.</w:t>
+        <w:t>Logo et mentions légales personnalisables.</w:t>
       </w:r>
     </w:p>
     <w:p>
       <w:pPr>
         <w:numPr>
           <w:ilvl w:val="0"/>
-          <w:numId w:val="27"/>
+          <w:numId w:val="43"/>
         </w:numPr>
       </w:pPr>
       <w:r>
-        <w:t>Gestion de plusieurs sociétés.</w:t>
+        <w:t>Gestion multi-sociétés.</w:t>
       </w:r>
     </w:p>
     <w:p>
       <w:pPr>
         <w:numPr>
           <w:ilvl w:val="0"/>
-          <w:numId w:val="27"/>
+          <w:numId w:val="43"/>
         </w:numPr>
       </w:pPr>
       <w:r>
-        <w:t>Paramètres de connexion email.</w:t>
+        <w:t>Paramètres email (envoi automatique des documents).</w:t>
       </w:r>
     </w:p>
     <w:p>
       <w:pPr>
         <w:numPr>
           <w:ilvl w:val="0"/>
-          <w:numId w:val="27"/>
+          <w:numId w:val="43"/>
         </w:numPr>
       </w:pPr>
       <w:r>
-        <w:t>Activation/désactivation de fonctionnalités (stock, tranches, factures d’acompte, bons de livraison…).</w:t>
+        <w:t>Activation/désactivation de fonctionnalités (stock, tranches, bons de livraison, multi-sociétés…).</w:t>
       </w:r>
     </w:p>
     <w:p>
       <w:pPr>
         <w:numPr>
           <w:ilvl w:val="0"/>
-          <w:numId w:val="27"/>
+          <w:numId w:val="43"/>
         </w:numPr>
       </w:pPr>
       <w:r>
-        <w:t>Gestion des utilisateurs (réservée à l’administrateur).</w:t>
+        <w:lastRenderedPageBreak/>
+        <w:t>Gestion des utilisateurs par l’administrateur.</w:t>
       </w:r>
     </w:p>
     <w:p>
-      <w:r>
-        <w:lastRenderedPageBreak/>
-        <w:pict w14:anchorId="508D6966">
-          <v:rect id="_x0000_i1172" style="width:0;height:1.5pt" o:hralign="center" o:hrstd="t" o:hr="t" fillcolor="#a0a0a0" stroked="f"/>
+      <w:pPr>
+        <w:numPr>
+          <w:ilvl w:val="0"/>
+          <w:numId w:val="43"/>
+        </w:numPr>
+      </w:pPr>
+      <w:r>
+        <w:t>Ajout/Modif</w:t>
+      </w:r>
+      <w:r>
+        <w:t>ication</w:t>
+      </w:r>
+      <w:r>
+        <w:t>/Suppression sur les taux de TVA, modes de règlements, répertoire pour l’export des document (comptabilité), civilités/formes juridique des clients.</w:t>
+      </w:r>
+    </w:p>
+    <w:p>
+      <w:pPr>
+        <w:ind w:left="720"/>
+      </w:pPr>
+    </w:p>
+    <w:p>
+      <w:r>
+        <w:pict w14:anchorId="4767DB13">
+          <v:rect id="_x0000_i1100" style="width:0;height:1.5pt" o:hralign="center" o:hrstd="t" o:hr="t" fillcolor="#a0a0a0" stroked="f"/>
         </w:pict>
       </w:r>
     </w:p>
@@ -808,7 +853,7 @@
       <w:pPr>
         <w:numPr>
           <w:ilvl w:val="0"/>
-          <w:numId w:val="28"/>
+          <w:numId w:val="44"/>
         </w:numPr>
       </w:pPr>
       <w:r>
@@ -816,17 +861,25 @@
           <w:b/>
           <w:bCs/>
         </w:rPr>
-        <w:t>Langage &amp; IDE</w:t>
-      </w:r>
-      <w:r>
-        <w:t xml:space="preserve"> : WinDev</w:t>
+        <w:t>Framework</w:t>
+      </w:r>
+      <w:r>
+        <w:t xml:space="preserve"> : </w:t>
+      </w:r>
+      <w:proofErr w:type="spellStart"/>
+      <w:r>
+        <w:t>Laravel</w:t>
+      </w:r>
+      <w:proofErr w:type="spellEnd"/>
+      <w:r>
+        <w:t xml:space="preserve"> (PHP)</w:t>
       </w:r>
     </w:p>
     <w:p>
       <w:pPr>
         <w:numPr>
           <w:ilvl w:val="0"/>
-          <w:numId w:val="28"/>
+          <w:numId w:val="44"/>
         </w:numPr>
       </w:pPr>
       <w:r>
@@ -837,14 +890,19 @@
         <w:t>Base de données</w:t>
       </w:r>
       <w:r>
-        <w:t xml:space="preserve"> : HyperFileSQL</w:t>
-      </w:r>
+        <w:t xml:space="preserve"> : MySQL / </w:t>
+      </w:r>
+      <w:proofErr w:type="spellStart"/>
+      <w:r>
+        <w:t>MariaDB</w:t>
+      </w:r>
+      <w:proofErr w:type="spellEnd"/>
     </w:p>
     <w:p>
       <w:pPr>
         <w:numPr>
           <w:ilvl w:val="0"/>
-          <w:numId w:val="28"/>
+          <w:numId w:val="44"/>
         </w:numPr>
       </w:pPr>
       <w:r>
@@ -852,34 +910,77 @@
           <w:b/>
           <w:bCs/>
         </w:rPr>
-        <w:t>Plateforme</w:t>
-      </w:r>
-      <w:r>
-        <w:t xml:space="preserve"> : Windows (client lourd)</w:t>
+        <w:t>Serveur web</w:t>
+      </w:r>
+      <w:r>
+        <w:t xml:space="preserve"> : Apache ou Nginx</w:t>
       </w:r>
     </w:p>
     <w:p>
       <w:pPr>
         <w:numPr>
           <w:ilvl w:val="0"/>
-          <w:numId w:val="28"/>
+          <w:numId w:val="44"/>
         </w:numPr>
       </w:pPr>
+      <w:proofErr w:type="spellStart"/>
       <w:r>
         <w:rPr>
           <w:b/>
           <w:bCs/>
         </w:rPr>
-        <w:t>Normes légales</w:t>
-      </w:r>
-      <w:r>
-        <w:t xml:space="preserve"> : conformité aux règles de facturation (mentions obligatoires : SIRET, TVA, etc.)</w:t>
-      </w:r>
+        <w:t>Front-end</w:t>
+      </w:r>
+      <w:proofErr w:type="spellEnd"/>
+      <w:r>
+        <w:t xml:space="preserve"> : Blade + Bootstrap/</w:t>
+      </w:r>
+      <w:proofErr w:type="spellStart"/>
+      <w:r>
+        <w:t>Tailwind</w:t>
+      </w:r>
+      <w:proofErr w:type="spellEnd"/>
     </w:p>
     <w:p>
-      <w:r>
-        <w:pict w14:anchorId="5C113D2D">
-          <v:rect id="_x0000_i1173" style="width:0;height:1.5pt" o:hralign="center" o:hrstd="t" o:hr="t" fillcolor="#a0a0a0" stroked="f"/>
+      <w:pPr>
+        <w:numPr>
+          <w:ilvl w:val="0"/>
+          <w:numId w:val="44"/>
+        </w:numPr>
+      </w:pPr>
+      <w:r>
+        <w:rPr>
+          <w:b/>
+          <w:bCs/>
+        </w:rPr>
+        <w:t>Hébergement</w:t>
+      </w:r>
+      <w:r>
+        <w:t xml:space="preserve"> : serveur Linux (mutualisé ou dédié)</w:t>
+      </w:r>
+    </w:p>
+    <w:p>
+      <w:pPr>
+        <w:numPr>
+          <w:ilvl w:val="0"/>
+          <w:numId w:val="44"/>
+        </w:numPr>
+      </w:pPr>
+      <w:r>
+        <w:rPr>
+          <w:b/>
+          <w:bCs/>
+        </w:rPr>
+        <w:t>Compatibilité</w:t>
+      </w:r>
+      <w:r>
+        <w:t xml:space="preserve"> : navigateurs modernes (Chrome, Edge, Firefox)</w:t>
+      </w:r>
+    </w:p>
+    <w:p>
+      <w:r>
+        <w:pict w14:anchorId="764C3560">
+          <v:rect id="_x0000_i1101" style="width:0;height:1.5pt" o:hralign="center" o:hrstd="t" o:hr="t" fillcolor="#a0a0a0" stroked="f"/>
         </w:pict>
       </w:r>
     </w:p>
@@ -902,39 +1003,74 @@
       <w:pPr>
         <w:numPr>
           <w:ilvl w:val="0"/>
-          <w:numId w:val="29"/>
+          <w:numId w:val="45"/>
         </w:numPr>
       </w:pPr>
-      <w:r>
-        <w:t>Hashage des mots de passe.</w:t>
+      <w:proofErr w:type="spellStart"/>
+      <w:r>
+        <w:t>Hashage</w:t>
+      </w:r>
+      <w:proofErr w:type="spellEnd"/>
+      <w:r>
+        <w:t xml:space="preserve"> des mots de passe (</w:t>
+      </w:r>
+      <w:proofErr w:type="spellStart"/>
+      <w:r>
+        <w:t>bcrypt</w:t>
+      </w:r>
+      <w:proofErr w:type="spellEnd"/>
+      <w:r>
+        <w:t>).</w:t>
       </w:r>
     </w:p>
     <w:p>
       <w:pPr>
         <w:numPr>
           <w:ilvl w:val="0"/>
-          <w:numId w:val="29"/>
+          <w:numId w:val="45"/>
         </w:numPr>
       </w:pPr>
       <w:r>
-        <w:t>Gestion des rôles et droits d’accès.</w:t>
+        <w:t>Middleware d’authentification et gestion des sessions.</w:t>
       </w:r>
     </w:p>
     <w:p>
       <w:pPr>
         <w:numPr>
           <w:ilvl w:val="0"/>
-          <w:numId w:val="29"/>
+          <w:numId w:val="45"/>
         </w:numPr>
       </w:pPr>
       <w:r>
-        <w:t>Sauvegardes régulières de la base de données.</w:t>
+        <w:t>Rôles et permissions par utilisateur.</w:t>
       </w:r>
     </w:p>
     <w:p>
-      <w:r>
-        <w:pict w14:anchorId="1C64E05C">
-          <v:rect id="_x0000_i1174" style="width:0;height:1.5pt" o:hralign="center" o:hrstd="t" o:hr="t" fillcolor="#a0a0a0" stroked="f"/>
+      <w:pPr>
+        <w:numPr>
+          <w:ilvl w:val="0"/>
+          <w:numId w:val="45"/>
+        </w:numPr>
+      </w:pPr>
+      <w:r>
+        <w:t>Sauvegardes automatiques de la base de données.</w:t>
+      </w:r>
+    </w:p>
+    <w:p>
+      <w:pPr>
+        <w:numPr>
+          <w:ilvl w:val="0"/>
+          <w:numId w:val="45"/>
+        </w:numPr>
+      </w:pPr>
+      <w:r>
+        <w:t>Connexion sécurisée en HTTPS.</w:t>
+      </w:r>
+    </w:p>
+    <w:p>
+      <w:r>
+        <w:pict w14:anchorId="64A89D08">
+          <v:rect id="_x0000_i1102" style="width:0;height:1.5pt" o:hralign="center" o:hrstd="t" o:hr="t" fillcolor="#a0a0a0" stroked="f"/>
         </w:pict>
       </w:r>
     </w:p>
@@ -957,18 +1093,26 @@
       <w:pPr>
         <w:numPr>
           <w:ilvl w:val="0"/>
-          <w:numId w:val="30"/>
+          <w:numId w:val="46"/>
         </w:numPr>
       </w:pPr>
       <w:r>
-        <w:t>Logiciel WinGestion (exécutable + base de données).</w:t>
+        <w:t xml:space="preserve">Application </w:t>
+      </w:r>
+      <w:proofErr w:type="spellStart"/>
+      <w:r>
+        <w:t>WebGestion</w:t>
+      </w:r>
+      <w:proofErr w:type="spellEnd"/>
+      <w:r>
+        <w:t xml:space="preserve"> (code source + base de données).</w:t>
       </w:r>
     </w:p>
     <w:p>
       <w:pPr>
         <w:numPr>
           <w:ilvl w:val="0"/>
-          <w:numId w:val="30"/>
+          <w:numId w:val="46"/>
         </w:numPr>
       </w:pPr>
       <w:r>
@@ -979,18 +1123,18 @@
       <w:pPr>
         <w:numPr>
           <w:ilvl w:val="0"/>
-          <w:numId w:val="30"/>
+          <w:numId w:val="46"/>
         </w:numPr>
       </w:pPr>
       <w:r>
-        <w:t>Jeu d’essai (base de données de test).</w:t>
+        <w:t>Jeu d’essai (données fictives).</w:t>
       </w:r>
     </w:p>
     <w:p>
       <w:pPr>
         <w:numPr>
           <w:ilvl w:val="0"/>
-          <w:numId w:val="30"/>
+          <w:numId w:val="46"/>
         </w:numPr>
       </w:pPr>
       <w:r>
@@ -1001,7 +1145,7 @@
       <w:pPr>
         <w:numPr>
           <w:ilvl w:val="0"/>
-          <w:numId w:val="30"/>
+          <w:numId w:val="46"/>
         </w:numPr>
       </w:pPr>
       <w:r>
@@ -1010,8 +1154,8 @@
     </w:p>
     <w:p>
       <w:r>
-        <w:pict w14:anchorId="64FFEA4F">
-          <v:rect id="_x0000_i1175" style="width:0;height:1.5pt" o:hralign="center" o:hrstd="t" o:hr="t" fillcolor="#a0a0a0" stroked="f"/>
+        <w:pict w14:anchorId="339D312C">
+          <v:rect id="_x0000_i1103" style="width:0;height:1.5pt" o:hralign="center" o:hrstd="t" o:hr="t" fillcolor="#a0a0a0" stroked="f"/>
         </w:pict>
       </w:r>
     </w:p>
@@ -1034,7 +1178,7 @@
       <w:pPr>
         <w:numPr>
           <w:ilvl w:val="0"/>
-          <w:numId w:val="31"/>
+          <w:numId w:val="47"/>
         </w:numPr>
       </w:pPr>
       <w:r>
@@ -1045,32 +1189,41 @@
       <w:pPr>
         <w:numPr>
           <w:ilvl w:val="0"/>
-          <w:numId w:val="31"/>
+          <w:numId w:val="47"/>
         </w:numPr>
       </w:pPr>
       <w:r>
-        <w:t>Conception (MCD, interfaces) – 3 semaines</w:t>
+        <w:t xml:space="preserve">Conception (MCD, interfaces, routes </w:t>
+      </w:r>
+      <w:proofErr w:type="spellStart"/>
+      <w:r>
+        <w:t>Laravel</w:t>
+      </w:r>
+      <w:proofErr w:type="spellEnd"/>
+      <w:r>
+        <w:t>) – 3 semaines</w:t>
       </w:r>
     </w:p>
     <w:p>
       <w:pPr>
         <w:numPr>
           <w:ilvl w:val="0"/>
-          <w:numId w:val="31"/>
+          <w:numId w:val="47"/>
         </w:numPr>
       </w:pPr>
       <w:r>
-        <w:t>Développement – 6 semaines</w:t>
+        <w:t>Développement – 7 semaines</w:t>
       </w:r>
     </w:p>
     <w:p>
       <w:pPr>
         <w:numPr>
           <w:ilvl w:val="0"/>
-          <w:numId w:val="31"/>
+          <w:numId w:val="47"/>
         </w:numPr>
       </w:pPr>
       <w:r>
+        <w:lastRenderedPageBreak/>
         <w:t>Tests et corrections – 2 semaines</w:t>
       </w:r>
     </w:p>
@@ -1078,7 +1231,7 @@
       <w:pPr>
         <w:numPr>
           <w:ilvl w:val="0"/>
-          <w:numId w:val="31"/>
+          <w:numId w:val="47"/>
         </w:numPr>
       </w:pPr>
       <w:r>
@@ -1091,13 +1244,13 @@
           <w:b/>
           <w:bCs/>
         </w:rPr>
-        <w:t>Durée totale estimée : 14 semaines</w:t>
+        <w:t>Durée totale estimée : 15 semaines</w:t>
       </w:r>
     </w:p>
     <w:p>
       <w:r>
-        <w:pict w14:anchorId="48CCBE14">
-          <v:rect id="_x0000_i1176" style="width:0;height:1.5pt" o:hralign="center" o:hrstd="t" o:hr="t" fillcolor="#a0a0a0" stroked="f"/>
+        <w:pict w14:anchorId="307422BA">
+          <v:rect id="_x0000_i1104" style="width:0;height:1.5pt" o:hralign="center" o:hrstd="t" o:hr="t" fillcolor="#a0a0a0" stroked="f"/>
         </w:pict>
       </w:r>
     </w:p>
@@ -1120,40 +1273,39 @@
       <w:pPr>
         <w:numPr>
           <w:ilvl w:val="0"/>
-          <w:numId w:val="32"/>
+          <w:numId w:val="48"/>
         </w:numPr>
       </w:pPr>
       <w:r>
-        <w:t>Développement interne (WinDev déjà disponible).</w:t>
+        <w:t>Développement interne.</w:t>
       </w:r>
     </w:p>
     <w:p>
       <w:pPr>
         <w:numPr>
           <w:ilvl w:val="0"/>
-          <w:numId w:val="32"/>
+          <w:numId w:val="48"/>
         </w:numPr>
       </w:pPr>
       <w:r>
-        <w:t>Aucun coût d’hébergement (client lourd).</w:t>
+        <w:t>Hébergement serveur (mutualisé ou cloud).</w:t>
       </w:r>
     </w:p>
     <w:p>
       <w:pPr>
         <w:numPr>
           <w:ilvl w:val="0"/>
-          <w:numId w:val="32"/>
+          <w:numId w:val="48"/>
         </w:numPr>
       </w:pPr>
       <w:r>
-        <w:lastRenderedPageBreak/>
-        <w:t>Seuls coûts : temps de développement + support utilisateur.</w:t>
+        <w:t>Coûts liés au temps de développement + maintenance.</w:t>
       </w:r>
     </w:p>
     <w:p>
       <w:r>
-        <w:pict w14:anchorId="71A4D5E3">
-          <v:rect id="_x0000_i1177" style="width:0;height:1.5pt" o:hralign="center" o:hrstd="t" o:hr="t" fillcolor="#a0a0a0" stroked="f"/>
+        <w:pict w14:anchorId="726506D2">
+          <v:rect id="_x0000_i1105" style="width:0;height:1.5pt" o:hralign="center" o:hrstd="t" o:hr="t" fillcolor="#a0a0a0" stroked="f"/>
         </w:pict>
       </w:r>
     </w:p>
@@ -1176,32 +1328,11 @@
       <w:pPr>
         <w:numPr>
           <w:ilvl w:val="0"/>
-          <w:numId w:val="33"/>
+          <w:numId w:val="49"/>
         </w:numPr>
       </w:pPr>
       <w:r>
-        <w:t xml:space="preserve">Connexion avec un </w:t>
-      </w:r>
-      <w:r>
-        <w:rPr>
-          <w:b/>
-          <w:bCs/>
-        </w:rPr>
-        <w:t>portail web client léger</w:t>
-      </w:r>
-      <w:r>
-        <w:t xml:space="preserve"> (Laravel).</w:t>
-      </w:r>
-    </w:p>
-    <w:p>
-      <w:pPr>
-        <w:numPr>
-          <w:ilvl w:val="0"/>
-          <w:numId w:val="33"/>
-        </w:numPr>
-      </w:pPr>
-      <w:r>
-        <w:t xml:space="preserve">Transmission des factures via le futur </w:t>
+        <w:t xml:space="preserve">Intégration avec le </w:t>
       </w:r>
       <w:r>
         <w:rPr>
@@ -1218,21 +1349,33 @@
       <w:pPr>
         <w:numPr>
           <w:ilvl w:val="0"/>
-          <w:numId w:val="33"/>
+          <w:numId w:val="49"/>
         </w:numPr>
       </w:pPr>
       <w:r>
-        <w:t xml:space="preserve">Développement d’une </w:t>
-      </w:r>
-      <w:r>
-        <w:rPr>
-          <w:b/>
-          <w:bCs/>
-        </w:rPr>
-        <w:t>application mobile</w:t>
-      </w:r>
-      <w:r>
-        <w:t xml:space="preserve"> pour consultation en mobilité.</w:t>
+        <w:t>Application mobile (consultation et création rapide de devis/factures).</w:t>
+      </w:r>
+    </w:p>
+    <w:p>
+      <w:pPr>
+        <w:numPr>
+          <w:ilvl w:val="0"/>
+          <w:numId w:val="49"/>
+        </w:numPr>
+      </w:pPr>
+      <w:r>
+        <w:t>API REST pour interconnexion avec d’autres systèmes (ex. comptabilité externe, e-commerce).</w:t>
+      </w:r>
+    </w:p>
+    <w:p>
+      <w:pPr>
+        <w:numPr>
+          <w:ilvl w:val="0"/>
+          <w:numId w:val="49"/>
+        </w:numPr>
+      </w:pPr>
+      <w:r>
+        <w:t>Ajout d’un module de gestion avancée des stocks (alertes sur seuils bas).</w:t>
       </w:r>
     </w:p>
     <w:p/>
@@ -1398,6 +1541,155 @@
     </w:lvl>
   </w:abstractNum>
   <w:abstractNum w:abstractNumId="1" w15:restartNumberingAfterBreak="0">
+    <w:nsid w:val="053A31CA"/>
+    <w:multiLevelType w:val="multilevel"/>
+    <w:tmpl w:val="9A763256"/>
+    <w:lvl w:ilvl="0">
+      <w:start w:val="1"/>
+      <w:numFmt w:val="bullet"/>
+      <w:lvlText w:val=""/>
+      <w:lvlJc w:val="left"/>
+      <w:pPr>
+        <w:tabs>
+          <w:tab w:val="num" w:pos="720"/>
+        </w:tabs>
+        <w:ind w:left="720" w:hanging="360"/>
+      </w:pPr>
+      <w:rPr>
+        <w:rFonts w:ascii="Symbol" w:hAnsi="Symbol" w:hint="default"/>
+        <w:sz w:val="20"/>
+      </w:rPr>
+    </w:lvl>
+    <w:lvl w:ilvl="1" w:tentative="1">
+      <w:start w:val="1"/>
+      <w:numFmt w:val="bullet"/>
+      <w:lvlText w:val="o"/>
+      <w:lvlJc w:val="left"/>
+      <w:pPr>
+        <w:tabs>
+          <w:tab w:val="num" w:pos="1440"/>
+        </w:tabs>
+        <w:ind w:left="1440" w:hanging="360"/>
+      </w:pPr>
+      <w:rPr>
+        <w:rFonts w:ascii="Courier New" w:hAnsi="Courier New" w:hint="default"/>
+        <w:sz w:val="20"/>
+      </w:rPr>
+    </w:lvl>
+    <w:lvl w:ilvl="2" w:tentative="1">
+      <w:start w:val="1"/>
+      <w:numFmt w:val="bullet"/>
+      <w:lvlText w:val=""/>
+      <w:lvlJc w:val="left"/>
+      <w:pPr>
+        <w:tabs>
+          <w:tab w:val="num" w:pos="2160"/>
+        </w:tabs>
+        <w:ind w:left="2160" w:hanging="360"/>
+      </w:pPr>
+      <w:rPr>
+        <w:rFonts w:ascii="Wingdings" w:hAnsi="Wingdings" w:hint="default"/>
+        <w:sz w:val="20"/>
+      </w:rPr>
+    </w:lvl>
+    <w:lvl w:ilvl="3" w:tentative="1">
+      <w:start w:val="1"/>
+      <w:numFmt w:val="bullet"/>
+      <w:lvlText w:val=""/>
+      <w:lvlJc w:val="left"/>
+      <w:pPr>
+        <w:tabs>
+          <w:tab w:val="num" w:pos="2880"/>
+        </w:tabs>
+        <w:ind w:left="2880" w:hanging="360"/>
+      </w:pPr>
+      <w:rPr>
+        <w:rFonts w:ascii="Wingdings" w:hAnsi="Wingdings" w:hint="default"/>
+        <w:sz w:val="20"/>
+      </w:rPr>
+    </w:lvl>
+    <w:lvl w:ilvl="4" w:tentative="1">
+      <w:start w:val="1"/>
+      <w:numFmt w:val="bullet"/>
+      <w:lvlText w:val=""/>
+      <w:lvlJc w:val="left"/>
+      <w:pPr>
+        <w:tabs>
+          <w:tab w:val="num" w:pos="3600"/>
+        </w:tabs>
+        <w:ind w:left="3600" w:hanging="360"/>
+      </w:pPr>
+      <w:rPr>
+        <w:rFonts w:ascii="Wingdings" w:hAnsi="Wingdings" w:hint="default"/>
+        <w:sz w:val="20"/>
+      </w:rPr>
+    </w:lvl>
+    <w:lvl w:ilvl="5" w:tentative="1">
+      <w:start w:val="1"/>
+      <w:numFmt w:val="bullet"/>
+      <w:lvlText w:val=""/>
+      <w:lvlJc w:val="left"/>
+      <w:pPr>
+        <w:tabs>
+          <w:tab w:val="num" w:pos="4320"/>
+        </w:tabs>
+        <w:ind w:left="4320" w:hanging="360"/>
+      </w:pPr>
+      <w:rPr>
+        <w:rFonts w:ascii="Wingdings" w:hAnsi="Wingdings" w:hint="default"/>
+        <w:sz w:val="20"/>
+      </w:rPr>
+    </w:lvl>
+    <w:lvl w:ilvl="6" w:tentative="1">
+      <w:start w:val="1"/>
+      <w:numFmt w:val="bullet"/>
+      <w:lvlText w:val=""/>
+      <w:lvlJc w:val="left"/>
+      <w:pPr>
+        <w:tabs>
+          <w:tab w:val="num" w:pos="5040"/>
+        </w:tabs>
+        <w:ind w:left="5040" w:hanging="360"/>
+      </w:pPr>
+      <w:rPr>
+        <w:rFonts w:ascii="Wingdings" w:hAnsi="Wingdings" w:hint="default"/>
+        <w:sz w:val="20"/>
+      </w:rPr>
+    </w:lvl>
+    <w:lvl w:ilvl="7" w:tentative="1">
+      <w:start w:val="1"/>
+      <w:numFmt w:val="bullet"/>
+      <w:lvlText w:val=""/>
+      <w:lvlJc w:val="left"/>
+      <w:pPr>
+        <w:tabs>
+          <w:tab w:val="num" w:pos="5760"/>
+        </w:tabs>
+        <w:ind w:left="5760" w:hanging="360"/>
+      </w:pPr>
+      <w:rPr>
+        <w:rFonts w:ascii="Wingdings" w:hAnsi="Wingdings" w:hint="default"/>
+        <w:sz w:val="20"/>
+      </w:rPr>
+    </w:lvl>
+    <w:lvl w:ilvl="8" w:tentative="1">
+      <w:start w:val="1"/>
+      <w:numFmt w:val="bullet"/>
+      <w:lvlText w:val=""/>
+      <w:lvlJc w:val="left"/>
+      <w:pPr>
+        <w:tabs>
+          <w:tab w:val="num" w:pos="6480"/>
+        </w:tabs>
+        <w:ind w:left="6480" w:hanging="360"/>
+      </w:pPr>
+      <w:rPr>
+        <w:rFonts w:ascii="Wingdings" w:hAnsi="Wingdings" w:hint="default"/>
+        <w:sz w:val="20"/>
+      </w:rPr>
+    </w:lvl>
+  </w:abstractNum>
+  <w:abstractNum w:abstractNumId="2" w15:restartNumberingAfterBreak="0">
     <w:nsid w:val="07306BD3"/>
     <w:multiLevelType w:val="multilevel"/>
     <w:tmpl w:val="787C8824"/>
@@ -1546,7 +1838,7 @@
       </w:rPr>
     </w:lvl>
   </w:abstractNum>
-  <w:abstractNum w:abstractNumId="2" w15:restartNumberingAfterBreak="0">
+  <w:abstractNum w:abstractNumId="3" w15:restartNumberingAfterBreak="0">
     <w:nsid w:val="0A476545"/>
     <w:multiLevelType w:val="multilevel"/>
     <w:tmpl w:val="9D4E272A"/>
@@ -1695,7 +1987,7 @@
       </w:rPr>
     </w:lvl>
   </w:abstractNum>
-  <w:abstractNum w:abstractNumId="3" w15:restartNumberingAfterBreak="0">
+  <w:abstractNum w:abstractNumId="4" w15:restartNumberingAfterBreak="0">
     <w:nsid w:val="0AB43BD6"/>
     <w:multiLevelType w:val="multilevel"/>
     <w:tmpl w:val="A09AA592"/>
@@ -1844,7 +2136,7 @@
       </w:rPr>
     </w:lvl>
   </w:abstractNum>
-  <w:abstractNum w:abstractNumId="4" w15:restartNumberingAfterBreak="0">
+  <w:abstractNum w:abstractNumId="5" w15:restartNumberingAfterBreak="0">
     <w:nsid w:val="0AE0531A"/>
     <w:multiLevelType w:val="multilevel"/>
     <w:tmpl w:val="AC4A4576"/>
@@ -1993,7 +2285,7 @@
       </w:rPr>
     </w:lvl>
   </w:abstractNum>
-  <w:abstractNum w:abstractNumId="5" w15:restartNumberingAfterBreak="0">
+  <w:abstractNum w:abstractNumId="6" w15:restartNumberingAfterBreak="0">
     <w:nsid w:val="0C402518"/>
     <w:multiLevelType w:val="multilevel"/>
     <w:tmpl w:val="7E900284"/>
@@ -2142,7 +2434,7 @@
       </w:rPr>
     </w:lvl>
   </w:abstractNum>
-  <w:abstractNum w:abstractNumId="6" w15:restartNumberingAfterBreak="0">
+  <w:abstractNum w:abstractNumId="7" w15:restartNumberingAfterBreak="0">
     <w:nsid w:val="111331C9"/>
     <w:multiLevelType w:val="multilevel"/>
     <w:tmpl w:val="5038F25C"/>
@@ -2291,7 +2583,7 @@
       </w:rPr>
     </w:lvl>
   </w:abstractNum>
-  <w:abstractNum w:abstractNumId="7" w15:restartNumberingAfterBreak="0">
+  <w:abstractNum w:abstractNumId="8" w15:restartNumberingAfterBreak="0">
     <w:nsid w:val="155F010B"/>
     <w:multiLevelType w:val="multilevel"/>
     <w:tmpl w:val="53681F30"/>
@@ -2440,7 +2732,7 @@
       </w:rPr>
     </w:lvl>
   </w:abstractNum>
-  <w:abstractNum w:abstractNumId="8" w15:restartNumberingAfterBreak="0">
+  <w:abstractNum w:abstractNumId="9" w15:restartNumberingAfterBreak="0">
     <w:nsid w:val="15F179D6"/>
     <w:multiLevelType w:val="multilevel"/>
     <w:tmpl w:val="BBAA1B62"/>
@@ -2589,7 +2881,7 @@
       </w:rPr>
     </w:lvl>
   </w:abstractNum>
-  <w:abstractNum w:abstractNumId="9" w15:restartNumberingAfterBreak="0">
+  <w:abstractNum w:abstractNumId="10" w15:restartNumberingAfterBreak="0">
     <w:nsid w:val="18DE26B5"/>
     <w:multiLevelType w:val="multilevel"/>
     <w:tmpl w:val="6E32EDDA"/>
@@ -2738,7 +3030,7 @@
       </w:rPr>
     </w:lvl>
   </w:abstractNum>
-  <w:abstractNum w:abstractNumId="10" w15:restartNumberingAfterBreak="0">
+  <w:abstractNum w:abstractNumId="11" w15:restartNumberingAfterBreak="0">
     <w:nsid w:val="19EB092A"/>
     <w:multiLevelType w:val="multilevel"/>
     <w:tmpl w:val="832A457A"/>
@@ -2887,7 +3179,7 @@
       </w:rPr>
     </w:lvl>
   </w:abstractNum>
-  <w:abstractNum w:abstractNumId="11" w15:restartNumberingAfterBreak="0">
+  <w:abstractNum w:abstractNumId="12" w15:restartNumberingAfterBreak="0">
     <w:nsid w:val="1A607EA6"/>
     <w:multiLevelType w:val="multilevel"/>
     <w:tmpl w:val="DB002CB2"/>
@@ -3000,7 +3292,7 @@
       </w:pPr>
     </w:lvl>
   </w:abstractNum>
-  <w:abstractNum w:abstractNumId="12" w15:restartNumberingAfterBreak="0">
+  <w:abstractNum w:abstractNumId="13" w15:restartNumberingAfterBreak="0">
     <w:nsid w:val="1ACA731E"/>
     <w:multiLevelType w:val="multilevel"/>
     <w:tmpl w:val="14705DE4"/>
@@ -3149,7 +3441,7 @@
       </w:rPr>
     </w:lvl>
   </w:abstractNum>
-  <w:abstractNum w:abstractNumId="13" w15:restartNumberingAfterBreak="0">
+  <w:abstractNum w:abstractNumId="14" w15:restartNumberingAfterBreak="0">
     <w:nsid w:val="21BD7E68"/>
     <w:multiLevelType w:val="multilevel"/>
     <w:tmpl w:val="550042D2"/>
@@ -3298,7 +3590,7 @@
       </w:rPr>
     </w:lvl>
   </w:abstractNum>
-  <w:abstractNum w:abstractNumId="14" w15:restartNumberingAfterBreak="0">
+  <w:abstractNum w:abstractNumId="15" w15:restartNumberingAfterBreak="0">
     <w:nsid w:val="236D43AE"/>
     <w:multiLevelType w:val="multilevel"/>
     <w:tmpl w:val="66E6DBAC"/>
@@ -3447,7 +3739,418 @@
       </w:rPr>
     </w:lvl>
   </w:abstractNum>
-  <w:abstractNum w:abstractNumId="15" w15:restartNumberingAfterBreak="0">
+  <w:abstractNum w:abstractNumId="16" w15:restartNumberingAfterBreak="0">
+    <w:nsid w:val="25B9725D"/>
+    <w:multiLevelType w:val="multilevel"/>
+    <w:tmpl w:val="31B8C9A8"/>
+    <w:lvl w:ilvl="0">
+      <w:start w:val="1"/>
+      <w:numFmt w:val="bullet"/>
+      <w:lvlText w:val=""/>
+      <w:lvlJc w:val="left"/>
+      <w:pPr>
+        <w:tabs>
+          <w:tab w:val="num" w:pos="720"/>
+        </w:tabs>
+        <w:ind w:left="720" w:hanging="360"/>
+      </w:pPr>
+      <w:rPr>
+        <w:rFonts w:ascii="Symbol" w:hAnsi="Symbol" w:hint="default"/>
+        <w:sz w:val="20"/>
+      </w:rPr>
+    </w:lvl>
+    <w:lvl w:ilvl="1" w:tentative="1">
+      <w:start w:val="1"/>
+      <w:numFmt w:val="bullet"/>
+      <w:lvlText w:val="o"/>
+      <w:lvlJc w:val="left"/>
+      <w:pPr>
+        <w:tabs>
+          <w:tab w:val="num" w:pos="1440"/>
+        </w:tabs>
+        <w:ind w:left="1440" w:hanging="360"/>
+      </w:pPr>
+      <w:rPr>
+        <w:rFonts w:ascii="Courier New" w:hAnsi="Courier New" w:hint="default"/>
+        <w:sz w:val="20"/>
+      </w:rPr>
+    </w:lvl>
+    <w:lvl w:ilvl="2" w:tentative="1">
+      <w:start w:val="1"/>
+      <w:numFmt w:val="bullet"/>
+      <w:lvlText w:val=""/>
+      <w:lvlJc w:val="left"/>
+      <w:pPr>
+        <w:tabs>
+          <w:tab w:val="num" w:pos="2160"/>
+        </w:tabs>
+        <w:ind w:left="2160" w:hanging="360"/>
+      </w:pPr>
+      <w:rPr>
+        <w:rFonts w:ascii="Wingdings" w:hAnsi="Wingdings" w:hint="default"/>
+        <w:sz w:val="20"/>
+      </w:rPr>
+    </w:lvl>
+    <w:lvl w:ilvl="3" w:tentative="1">
+      <w:start w:val="1"/>
+      <w:numFmt w:val="bullet"/>
+      <w:lvlText w:val=""/>
+      <w:lvlJc w:val="left"/>
+      <w:pPr>
+        <w:tabs>
+          <w:tab w:val="num" w:pos="2880"/>
+        </w:tabs>
+        <w:ind w:left="2880" w:hanging="360"/>
+      </w:pPr>
+      <w:rPr>
+        <w:rFonts w:ascii="Wingdings" w:hAnsi="Wingdings" w:hint="default"/>
+        <w:sz w:val="20"/>
+      </w:rPr>
+    </w:lvl>
+    <w:lvl w:ilvl="4" w:tentative="1">
+      <w:start w:val="1"/>
+      <w:numFmt w:val="bullet"/>
+      <w:lvlText w:val=""/>
+      <w:lvlJc w:val="left"/>
+      <w:pPr>
+        <w:tabs>
+          <w:tab w:val="num" w:pos="3600"/>
+        </w:tabs>
+        <w:ind w:left="3600" w:hanging="360"/>
+      </w:pPr>
+      <w:rPr>
+        <w:rFonts w:ascii="Wingdings" w:hAnsi="Wingdings" w:hint="default"/>
+        <w:sz w:val="20"/>
+      </w:rPr>
+    </w:lvl>
+    <w:lvl w:ilvl="5" w:tentative="1">
+      <w:start w:val="1"/>
+      <w:numFmt w:val="bullet"/>
+      <w:lvlText w:val=""/>
+      <w:lvlJc w:val="left"/>
+      <w:pPr>
+        <w:tabs>
+          <w:tab w:val="num" w:pos="4320"/>
+        </w:tabs>
+        <w:ind w:left="4320" w:hanging="360"/>
+      </w:pPr>
+      <w:rPr>
+        <w:rFonts w:ascii="Wingdings" w:hAnsi="Wingdings" w:hint="default"/>
+        <w:sz w:val="20"/>
+      </w:rPr>
+    </w:lvl>
+    <w:lvl w:ilvl="6" w:tentative="1">
+      <w:start w:val="1"/>
+      <w:numFmt w:val="bullet"/>
+      <w:lvlText w:val=""/>
+      <w:lvlJc w:val="left"/>
+      <w:pPr>
+        <w:tabs>
+          <w:tab w:val="num" w:pos="5040"/>
+        </w:tabs>
+        <w:ind w:left="5040" w:hanging="360"/>
+      </w:pPr>
+      <w:rPr>
+        <w:rFonts w:ascii="Wingdings" w:hAnsi="Wingdings" w:hint="default"/>
+        <w:sz w:val="20"/>
+      </w:rPr>
+    </w:lvl>
+    <w:lvl w:ilvl="7" w:tentative="1">
+      <w:start w:val="1"/>
+      <w:numFmt w:val="bullet"/>
+      <w:lvlText w:val=""/>
+      <w:lvlJc w:val="left"/>
+      <w:pPr>
+        <w:tabs>
+          <w:tab w:val="num" w:pos="5760"/>
+        </w:tabs>
+        <w:ind w:left="5760" w:hanging="360"/>
+      </w:pPr>
+      <w:rPr>
+        <w:rFonts w:ascii="Wingdings" w:hAnsi="Wingdings" w:hint="default"/>
+        <w:sz w:val="20"/>
+      </w:rPr>
+    </w:lvl>
+    <w:lvl w:ilvl="8" w:tentative="1">
+      <w:start w:val="1"/>
+      <w:numFmt w:val="bullet"/>
+      <w:lvlText w:val=""/>
+      <w:lvlJc w:val="left"/>
+      <w:pPr>
+        <w:tabs>
+          <w:tab w:val="num" w:pos="6480"/>
+        </w:tabs>
+        <w:ind w:left="6480" w:hanging="360"/>
+      </w:pPr>
+      <w:rPr>
+        <w:rFonts w:ascii="Wingdings" w:hAnsi="Wingdings" w:hint="default"/>
+        <w:sz w:val="20"/>
+      </w:rPr>
+    </w:lvl>
+  </w:abstractNum>
+  <w:abstractNum w:abstractNumId="17" w15:restartNumberingAfterBreak="0">
+    <w:nsid w:val="267F0768"/>
+    <w:multiLevelType w:val="multilevel"/>
+    <w:tmpl w:val="C144E35E"/>
+    <w:lvl w:ilvl="0">
+      <w:start w:val="1"/>
+      <w:numFmt w:val="decimal"/>
+      <w:lvlText w:val="%1."/>
+      <w:lvlJc w:val="left"/>
+      <w:pPr>
+        <w:tabs>
+          <w:tab w:val="num" w:pos="720"/>
+        </w:tabs>
+        <w:ind w:left="720" w:hanging="360"/>
+      </w:pPr>
+    </w:lvl>
+    <w:lvl w:ilvl="1" w:tentative="1">
+      <w:start w:val="1"/>
+      <w:numFmt w:val="decimal"/>
+      <w:lvlText w:val="%2."/>
+      <w:lvlJc w:val="left"/>
+      <w:pPr>
+        <w:tabs>
+          <w:tab w:val="num" w:pos="1440"/>
+        </w:tabs>
+        <w:ind w:left="1440" w:hanging="360"/>
+      </w:pPr>
+    </w:lvl>
+    <w:lvl w:ilvl="2" w:tentative="1">
+      <w:start w:val="1"/>
+      <w:numFmt w:val="decimal"/>
+      <w:lvlText w:val="%3."/>
+      <w:lvlJc w:val="left"/>
+      <w:pPr>
+        <w:tabs>
+          <w:tab w:val="num" w:pos="2160"/>
+        </w:tabs>
+        <w:ind w:left="2160" w:hanging="360"/>
+      </w:pPr>
+    </w:lvl>
+    <w:lvl w:ilvl="3" w:tentative="1">
+      <w:start w:val="1"/>
+      <w:numFmt w:val="decimal"/>
+      <w:lvlText w:val="%4."/>
+      <w:lvlJc w:val="left"/>
+      <w:pPr>
+        <w:tabs>
+          <w:tab w:val="num" w:pos="2880"/>
+        </w:tabs>
+        <w:ind w:left="2880" w:hanging="360"/>
+      </w:pPr>
+    </w:lvl>
+    <w:lvl w:ilvl="4" w:tentative="1">
+      <w:start w:val="1"/>
+      <w:numFmt w:val="decimal"/>
+      <w:lvlText w:val="%5."/>
+      <w:lvlJc w:val="left"/>
+      <w:pPr>
+        <w:tabs>
+          <w:tab w:val="num" w:pos="3600"/>
+        </w:tabs>
+        <w:ind w:left="3600" w:hanging="360"/>
+      </w:pPr>
+    </w:lvl>
+    <w:lvl w:ilvl="5" w:tentative="1">
+      <w:start w:val="1"/>
+      <w:numFmt w:val="decimal"/>
+      <w:lvlText w:val="%6."/>
+      <w:lvlJc w:val="left"/>
+      <w:pPr>
+        <w:tabs>
+          <w:tab w:val="num" w:pos="4320"/>
+        </w:tabs>
+        <w:ind w:left="4320" w:hanging="360"/>
+      </w:pPr>
+    </w:lvl>
+    <w:lvl w:ilvl="6" w:tentative="1">
+      <w:start w:val="1"/>
+      <w:numFmt w:val="decimal"/>
+      <w:lvlText w:val="%7."/>
+      <w:lvlJc w:val="left"/>
+      <w:pPr>
+        <w:tabs>
+          <w:tab w:val="num" w:pos="5040"/>
+        </w:tabs>
+        <w:ind w:left="5040" w:hanging="360"/>
+      </w:pPr>
+    </w:lvl>
+    <w:lvl w:ilvl="7" w:tentative="1">
+      <w:start w:val="1"/>
+      <w:numFmt w:val="decimal"/>
+      <w:lvlText w:val="%8."/>
+      <w:lvlJc w:val="left"/>
+      <w:pPr>
+        <w:tabs>
+          <w:tab w:val="num" w:pos="5760"/>
+        </w:tabs>
+        <w:ind w:left="5760" w:hanging="360"/>
+      </w:pPr>
+    </w:lvl>
+    <w:lvl w:ilvl="8" w:tentative="1">
+      <w:start w:val="1"/>
+      <w:numFmt w:val="decimal"/>
+      <w:lvlText w:val="%9."/>
+      <w:lvlJc w:val="left"/>
+      <w:pPr>
+        <w:tabs>
+          <w:tab w:val="num" w:pos="6480"/>
+        </w:tabs>
+        <w:ind w:left="6480" w:hanging="360"/>
+      </w:pPr>
+    </w:lvl>
+  </w:abstractNum>
+  <w:abstractNum w:abstractNumId="18" w15:restartNumberingAfterBreak="0">
+    <w:nsid w:val="2B406839"/>
+    <w:multiLevelType w:val="multilevel"/>
+    <w:tmpl w:val="2F1ED89E"/>
+    <w:lvl w:ilvl="0">
+      <w:start w:val="1"/>
+      <w:numFmt w:val="bullet"/>
+      <w:lvlText w:val=""/>
+      <w:lvlJc w:val="left"/>
+      <w:pPr>
+        <w:tabs>
+          <w:tab w:val="num" w:pos="720"/>
+        </w:tabs>
+        <w:ind w:left="720" w:hanging="360"/>
+      </w:pPr>
+      <w:rPr>
+        <w:rFonts w:ascii="Symbol" w:hAnsi="Symbol" w:hint="default"/>
+        <w:sz w:val="20"/>
+      </w:rPr>
+    </w:lvl>
+    <w:lvl w:ilvl="1" w:tentative="1">
+      <w:start w:val="1"/>
+      <w:numFmt w:val="bullet"/>
+      <w:lvlText w:val="o"/>
+      <w:lvlJc w:val="left"/>
+      <w:pPr>
+        <w:tabs>
+          <w:tab w:val="num" w:pos="1440"/>
+        </w:tabs>
+        <w:ind w:left="1440" w:hanging="360"/>
+      </w:pPr>
+      <w:rPr>
+        <w:rFonts w:ascii="Courier New" w:hAnsi="Courier New" w:hint="default"/>
+        <w:sz w:val="20"/>
+      </w:rPr>
+    </w:lvl>
+    <w:lvl w:ilvl="2" w:tentative="1">
+      <w:start w:val="1"/>
+      <w:numFmt w:val="bullet"/>
+      <w:lvlText w:val=""/>
+      <w:lvlJc w:val="left"/>
+      <w:pPr>
+        <w:tabs>
+          <w:tab w:val="num" w:pos="2160"/>
+        </w:tabs>
+        <w:ind w:left="2160" w:hanging="360"/>
+      </w:pPr>
+      <w:rPr>
+        <w:rFonts w:ascii="Wingdings" w:hAnsi="Wingdings" w:hint="default"/>
+        <w:sz w:val="20"/>
+      </w:rPr>
+    </w:lvl>
+    <w:lvl w:ilvl="3" w:tentative="1">
+      <w:start w:val="1"/>
+      <w:numFmt w:val="bullet"/>
+      <w:lvlText w:val=""/>
+      <w:lvlJc w:val="left"/>
+      <w:pPr>
+        <w:tabs>
+          <w:tab w:val="num" w:pos="2880"/>
+        </w:tabs>
+        <w:ind w:left="2880" w:hanging="360"/>
+      </w:pPr>
+      <w:rPr>
+        <w:rFonts w:ascii="Wingdings" w:hAnsi="Wingdings" w:hint="default"/>
+        <w:sz w:val="20"/>
+      </w:rPr>
+    </w:lvl>
+    <w:lvl w:ilvl="4" w:tentative="1">
+      <w:start w:val="1"/>
+      <w:numFmt w:val="bullet"/>
+      <w:lvlText w:val=""/>
+      <w:lvlJc w:val="left"/>
+      <w:pPr>
+        <w:tabs>
+          <w:tab w:val="num" w:pos="3600"/>
+        </w:tabs>
+        <w:ind w:left="3600" w:hanging="360"/>
+      </w:pPr>
+      <w:rPr>
+        <w:rFonts w:ascii="Wingdings" w:hAnsi="Wingdings" w:hint="default"/>
+        <w:sz w:val="20"/>
+      </w:rPr>
+    </w:lvl>
+    <w:lvl w:ilvl="5" w:tentative="1">
+      <w:start w:val="1"/>
+      <w:numFmt w:val="bullet"/>
+      <w:lvlText w:val=""/>
+      <w:lvlJc w:val="left"/>
+      <w:pPr>
+        <w:tabs>
+          <w:tab w:val="num" w:pos="4320"/>
+        </w:tabs>
+        <w:ind w:left="4320" w:hanging="360"/>
+      </w:pPr>
+      <w:rPr>
+        <w:rFonts w:ascii="Wingdings" w:hAnsi="Wingdings" w:hint="default"/>
+        <w:sz w:val="20"/>
+      </w:rPr>
+    </w:lvl>
+    <w:lvl w:ilvl="6" w:tentative="1">
+      <w:start w:val="1"/>
+      <w:numFmt w:val="bullet"/>
+      <w:lvlText w:val=""/>
+      <w:lvlJc w:val="left"/>
+      <w:pPr>
+        <w:tabs>
+          <w:tab w:val="num" w:pos="5040"/>
+        </w:tabs>
+        <w:ind w:left="5040" w:hanging="360"/>
+      </w:pPr>
+      <w:rPr>
+        <w:rFonts w:ascii="Wingdings" w:hAnsi="Wingdings" w:hint="default"/>
+        <w:sz w:val="20"/>
+      </w:rPr>
+    </w:lvl>
+    <w:lvl w:ilvl="7" w:tentative="1">
+      <w:start w:val="1"/>
+      <w:numFmt w:val="bullet"/>
+      <w:lvlText w:val=""/>
+      <w:lvlJc w:val="left"/>
+      <w:pPr>
+        <w:tabs>
+          <w:tab w:val="num" w:pos="5760"/>
+        </w:tabs>
+        <w:ind w:left="5760" w:hanging="360"/>
+      </w:pPr>
+      <w:rPr>
+        <w:rFonts w:ascii="Wingdings" w:hAnsi="Wingdings" w:hint="default"/>
+        <w:sz w:val="20"/>
+      </w:rPr>
+    </w:lvl>
+    <w:lvl w:ilvl="8" w:tentative="1">
+      <w:start w:val="1"/>
+      <w:numFmt w:val="bullet"/>
+      <w:lvlText w:val=""/>
+      <w:lvlJc w:val="left"/>
+      <w:pPr>
+        <w:tabs>
+          <w:tab w:val="num" w:pos="6480"/>
+        </w:tabs>
+        <w:ind w:left="6480" w:hanging="360"/>
+      </w:pPr>
+      <w:rPr>
+        <w:rFonts w:ascii="Wingdings" w:hAnsi="Wingdings" w:hint="default"/>
+        <w:sz w:val="20"/>
+      </w:rPr>
+    </w:lvl>
+  </w:abstractNum>
+  <w:abstractNum w:abstractNumId="19" w15:restartNumberingAfterBreak="0">
     <w:nsid w:val="34E210DF"/>
     <w:multiLevelType w:val="multilevel"/>
     <w:tmpl w:val="F748111E"/>
@@ -3596,7 +4299,305 @@
       </w:rPr>
     </w:lvl>
   </w:abstractNum>
-  <w:abstractNum w:abstractNumId="16" w15:restartNumberingAfterBreak="0">
+  <w:abstractNum w:abstractNumId="20" w15:restartNumberingAfterBreak="0">
+    <w:nsid w:val="350C3E2B"/>
+    <w:multiLevelType w:val="multilevel"/>
+    <w:tmpl w:val="8F4E2130"/>
+    <w:lvl w:ilvl="0">
+      <w:start w:val="1"/>
+      <w:numFmt w:val="bullet"/>
+      <w:lvlText w:val=""/>
+      <w:lvlJc w:val="left"/>
+      <w:pPr>
+        <w:tabs>
+          <w:tab w:val="num" w:pos="720"/>
+        </w:tabs>
+        <w:ind w:left="720" w:hanging="360"/>
+      </w:pPr>
+      <w:rPr>
+        <w:rFonts w:ascii="Symbol" w:hAnsi="Symbol" w:hint="default"/>
+        <w:sz w:val="20"/>
+      </w:rPr>
+    </w:lvl>
+    <w:lvl w:ilvl="1" w:tentative="1">
+      <w:start w:val="1"/>
+      <w:numFmt w:val="bullet"/>
+      <w:lvlText w:val="o"/>
+      <w:lvlJc w:val="left"/>
+      <w:pPr>
+        <w:tabs>
+          <w:tab w:val="num" w:pos="1440"/>
+        </w:tabs>
+        <w:ind w:left="1440" w:hanging="360"/>
+      </w:pPr>
+      <w:rPr>
+        <w:rFonts w:ascii="Courier New" w:hAnsi="Courier New" w:hint="default"/>
+        <w:sz w:val="20"/>
+      </w:rPr>
+    </w:lvl>
+    <w:lvl w:ilvl="2" w:tentative="1">
+      <w:start w:val="1"/>
+      <w:numFmt w:val="bullet"/>
+      <w:lvlText w:val=""/>
+      <w:lvlJc w:val="left"/>
+      <w:pPr>
+        <w:tabs>
+          <w:tab w:val="num" w:pos="2160"/>
+        </w:tabs>
+        <w:ind w:left="2160" w:hanging="360"/>
+      </w:pPr>
+      <w:rPr>
+        <w:rFonts w:ascii="Wingdings" w:hAnsi="Wingdings" w:hint="default"/>
+        <w:sz w:val="20"/>
+      </w:rPr>
+    </w:lvl>
+    <w:lvl w:ilvl="3" w:tentative="1">
+      <w:start w:val="1"/>
+      <w:numFmt w:val="bullet"/>
+      <w:lvlText w:val=""/>
+      <w:lvlJc w:val="left"/>
+      <w:pPr>
+        <w:tabs>
+          <w:tab w:val="num" w:pos="2880"/>
+        </w:tabs>
+        <w:ind w:left="2880" w:hanging="360"/>
+      </w:pPr>
+      <w:rPr>
+        <w:rFonts w:ascii="Wingdings" w:hAnsi="Wingdings" w:hint="default"/>
+        <w:sz w:val="20"/>
+      </w:rPr>
+    </w:lvl>
+    <w:lvl w:ilvl="4" w:tentative="1">
+      <w:start w:val="1"/>
+      <w:numFmt w:val="bullet"/>
+      <w:lvlText w:val=""/>
+      <w:lvlJc w:val="left"/>
+      <w:pPr>
+        <w:tabs>
+          <w:tab w:val="num" w:pos="3600"/>
+        </w:tabs>
+        <w:ind w:left="3600" w:hanging="360"/>
+      </w:pPr>
+      <w:rPr>
+        <w:rFonts w:ascii="Wingdings" w:hAnsi="Wingdings" w:hint="default"/>
+        <w:sz w:val="20"/>
+      </w:rPr>
+    </w:lvl>
+    <w:lvl w:ilvl="5" w:tentative="1">
+      <w:start w:val="1"/>
+      <w:numFmt w:val="bullet"/>
+      <w:lvlText w:val=""/>
+      <w:lvlJc w:val="left"/>
+      <w:pPr>
+        <w:tabs>
+          <w:tab w:val="num" w:pos="4320"/>
+        </w:tabs>
+        <w:ind w:left="4320" w:hanging="360"/>
+      </w:pPr>
+      <w:rPr>
+        <w:rFonts w:ascii="Wingdings" w:hAnsi="Wingdings" w:hint="default"/>
+        <w:sz w:val="20"/>
+      </w:rPr>
+    </w:lvl>
+    <w:lvl w:ilvl="6" w:tentative="1">
+      <w:start w:val="1"/>
+      <w:numFmt w:val="bullet"/>
+      <w:lvlText w:val=""/>
+      <w:lvlJc w:val="left"/>
+      <w:pPr>
+        <w:tabs>
+          <w:tab w:val="num" w:pos="5040"/>
+        </w:tabs>
+        <w:ind w:left="5040" w:hanging="360"/>
+      </w:pPr>
+      <w:rPr>
+        <w:rFonts w:ascii="Wingdings" w:hAnsi="Wingdings" w:hint="default"/>
+        <w:sz w:val="20"/>
+      </w:rPr>
+    </w:lvl>
+    <w:lvl w:ilvl="7" w:tentative="1">
+      <w:start w:val="1"/>
+      <w:numFmt w:val="bullet"/>
+      <w:lvlText w:val=""/>
+      <w:lvlJc w:val="left"/>
+      <w:pPr>
+        <w:tabs>
+          <w:tab w:val="num" w:pos="5760"/>
+        </w:tabs>
+        <w:ind w:left="5760" w:hanging="360"/>
+      </w:pPr>
+      <w:rPr>
+        <w:rFonts w:ascii="Wingdings" w:hAnsi="Wingdings" w:hint="default"/>
+        <w:sz w:val="20"/>
+      </w:rPr>
+    </w:lvl>
+    <w:lvl w:ilvl="8" w:tentative="1">
+      <w:start w:val="1"/>
+      <w:numFmt w:val="bullet"/>
+      <w:lvlText w:val=""/>
+      <w:lvlJc w:val="left"/>
+      <w:pPr>
+        <w:tabs>
+          <w:tab w:val="num" w:pos="6480"/>
+        </w:tabs>
+        <w:ind w:left="6480" w:hanging="360"/>
+      </w:pPr>
+      <w:rPr>
+        <w:rFonts w:ascii="Wingdings" w:hAnsi="Wingdings" w:hint="default"/>
+        <w:sz w:val="20"/>
+      </w:rPr>
+    </w:lvl>
+  </w:abstractNum>
+  <w:abstractNum w:abstractNumId="21" w15:restartNumberingAfterBreak="0">
+    <w:nsid w:val="385B44C0"/>
+    <w:multiLevelType w:val="multilevel"/>
+    <w:tmpl w:val="946EE556"/>
+    <w:lvl w:ilvl="0">
+      <w:start w:val="1"/>
+      <w:numFmt w:val="bullet"/>
+      <w:lvlText w:val=""/>
+      <w:lvlJc w:val="left"/>
+      <w:pPr>
+        <w:tabs>
+          <w:tab w:val="num" w:pos="720"/>
+        </w:tabs>
+        <w:ind w:left="720" w:hanging="360"/>
+      </w:pPr>
+      <w:rPr>
+        <w:rFonts w:ascii="Symbol" w:hAnsi="Symbol" w:hint="default"/>
+        <w:sz w:val="20"/>
+      </w:rPr>
+    </w:lvl>
+    <w:lvl w:ilvl="1" w:tentative="1">
+      <w:start w:val="1"/>
+      <w:numFmt w:val="bullet"/>
+      <w:lvlText w:val="o"/>
+      <w:lvlJc w:val="left"/>
+      <w:pPr>
+        <w:tabs>
+          <w:tab w:val="num" w:pos="1440"/>
+        </w:tabs>
+        <w:ind w:left="1440" w:hanging="360"/>
+      </w:pPr>
+      <w:rPr>
+        <w:rFonts w:ascii="Courier New" w:hAnsi="Courier New" w:hint="default"/>
+        <w:sz w:val="20"/>
+      </w:rPr>
+    </w:lvl>
+    <w:lvl w:ilvl="2" w:tentative="1">
+      <w:start w:val="1"/>
+      <w:numFmt w:val="bullet"/>
+      <w:lvlText w:val=""/>
+      <w:lvlJc w:val="left"/>
+      <w:pPr>
+        <w:tabs>
+          <w:tab w:val="num" w:pos="2160"/>
+        </w:tabs>
+        <w:ind w:left="2160" w:hanging="360"/>
+      </w:pPr>
+      <w:rPr>
+        <w:rFonts w:ascii="Wingdings" w:hAnsi="Wingdings" w:hint="default"/>
+        <w:sz w:val="20"/>
+      </w:rPr>
+    </w:lvl>
+    <w:lvl w:ilvl="3" w:tentative="1">
+      <w:start w:val="1"/>
+      <w:numFmt w:val="bullet"/>
+      <w:lvlText w:val=""/>
+      <w:lvlJc w:val="left"/>
+      <w:pPr>
+        <w:tabs>
+          <w:tab w:val="num" w:pos="2880"/>
+        </w:tabs>
+        <w:ind w:left="2880" w:hanging="360"/>
+      </w:pPr>
+      <w:rPr>
+        <w:rFonts w:ascii="Wingdings" w:hAnsi="Wingdings" w:hint="default"/>
+        <w:sz w:val="20"/>
+      </w:rPr>
+    </w:lvl>
+    <w:lvl w:ilvl="4" w:tentative="1">
+      <w:start w:val="1"/>
+      <w:numFmt w:val="bullet"/>
+      <w:lvlText w:val=""/>
+      <w:lvlJc w:val="left"/>
+      <w:pPr>
+        <w:tabs>
+          <w:tab w:val="num" w:pos="3600"/>
+        </w:tabs>
+        <w:ind w:left="3600" w:hanging="360"/>
+      </w:pPr>
+      <w:rPr>
+        <w:rFonts w:ascii="Wingdings" w:hAnsi="Wingdings" w:hint="default"/>
+        <w:sz w:val="20"/>
+      </w:rPr>
+    </w:lvl>
+    <w:lvl w:ilvl="5" w:tentative="1">
+      <w:start w:val="1"/>
+      <w:numFmt w:val="bullet"/>
+      <w:lvlText w:val=""/>
+      <w:lvlJc w:val="left"/>
+      <w:pPr>
+        <w:tabs>
+          <w:tab w:val="num" w:pos="4320"/>
+        </w:tabs>
+        <w:ind w:left="4320" w:hanging="360"/>
+      </w:pPr>
+      <w:rPr>
+        <w:rFonts w:ascii="Wingdings" w:hAnsi="Wingdings" w:hint="default"/>
+        <w:sz w:val="20"/>
+      </w:rPr>
+    </w:lvl>
+    <w:lvl w:ilvl="6" w:tentative="1">
+      <w:start w:val="1"/>
+      <w:numFmt w:val="bullet"/>
+      <w:lvlText w:val=""/>
+      <w:lvlJc w:val="left"/>
+      <w:pPr>
+        <w:tabs>
+          <w:tab w:val="num" w:pos="5040"/>
+        </w:tabs>
+        <w:ind w:left="5040" w:hanging="360"/>
+      </w:pPr>
+      <w:rPr>
+        <w:rFonts w:ascii="Wingdings" w:hAnsi="Wingdings" w:hint="default"/>
+        <w:sz w:val="20"/>
+      </w:rPr>
+    </w:lvl>
+    <w:lvl w:ilvl="7" w:tentative="1">
+      <w:start w:val="1"/>
+      <w:numFmt w:val="bullet"/>
+      <w:lvlText w:val=""/>
+      <w:lvlJc w:val="left"/>
+      <w:pPr>
+        <w:tabs>
+          <w:tab w:val="num" w:pos="5760"/>
+        </w:tabs>
+        <w:ind w:left="5760" w:hanging="360"/>
+      </w:pPr>
+      <w:rPr>
+        <w:rFonts w:ascii="Wingdings" w:hAnsi="Wingdings" w:hint="default"/>
+        <w:sz w:val="20"/>
+      </w:rPr>
+    </w:lvl>
+    <w:lvl w:ilvl="8" w:tentative="1">
+      <w:start w:val="1"/>
+      <w:numFmt w:val="bullet"/>
+      <w:lvlText w:val=""/>
+      <w:lvlJc w:val="left"/>
+      <w:pPr>
+        <w:tabs>
+          <w:tab w:val="num" w:pos="6480"/>
+        </w:tabs>
+        <w:ind w:left="6480" w:hanging="360"/>
+      </w:pPr>
+      <w:rPr>
+        <w:rFonts w:ascii="Wingdings" w:hAnsi="Wingdings" w:hint="default"/>
+        <w:sz w:val="20"/>
+      </w:rPr>
+    </w:lvl>
+  </w:abstractNum>
+  <w:abstractNum w:abstractNumId="22" w15:restartNumberingAfterBreak="0">
     <w:nsid w:val="389E4D9B"/>
     <w:multiLevelType w:val="multilevel"/>
     <w:tmpl w:val="EC283920"/>
@@ -3745,7 +4746,7 @@
       </w:rPr>
     </w:lvl>
   </w:abstractNum>
-  <w:abstractNum w:abstractNumId="17" w15:restartNumberingAfterBreak="0">
+  <w:abstractNum w:abstractNumId="23" w15:restartNumberingAfterBreak="0">
     <w:nsid w:val="3A6B4908"/>
     <w:multiLevelType w:val="multilevel"/>
     <w:tmpl w:val="1DD8680C"/>
@@ -3894,7 +4895,7 @@
       </w:rPr>
     </w:lvl>
   </w:abstractNum>
-  <w:abstractNum w:abstractNumId="18" w15:restartNumberingAfterBreak="0">
+  <w:abstractNum w:abstractNumId="24" w15:restartNumberingAfterBreak="0">
     <w:nsid w:val="3A8711AA"/>
     <w:multiLevelType w:val="multilevel"/>
     <w:tmpl w:val="C2D8537C"/>
@@ -4043,7 +5044,7 @@
       </w:rPr>
     </w:lvl>
   </w:abstractNum>
-  <w:abstractNum w:abstractNumId="19" w15:restartNumberingAfterBreak="0">
+  <w:abstractNum w:abstractNumId="25" w15:restartNumberingAfterBreak="0">
     <w:nsid w:val="3B2C5034"/>
     <w:multiLevelType w:val="hybridMultilevel"/>
     <w:tmpl w:val="38B0FF04"/>
@@ -4156,7 +5157,156 @@
       </w:rPr>
     </w:lvl>
   </w:abstractNum>
-  <w:abstractNum w:abstractNumId="20" w15:restartNumberingAfterBreak="0">
+  <w:abstractNum w:abstractNumId="26" w15:restartNumberingAfterBreak="0">
+    <w:nsid w:val="3C1A010F"/>
+    <w:multiLevelType w:val="multilevel"/>
+    <w:tmpl w:val="9334A5C6"/>
+    <w:lvl w:ilvl="0">
+      <w:start w:val="1"/>
+      <w:numFmt w:val="bullet"/>
+      <w:lvlText w:val=""/>
+      <w:lvlJc w:val="left"/>
+      <w:pPr>
+        <w:tabs>
+          <w:tab w:val="num" w:pos="720"/>
+        </w:tabs>
+        <w:ind w:left="720" w:hanging="360"/>
+      </w:pPr>
+      <w:rPr>
+        <w:rFonts w:ascii="Symbol" w:hAnsi="Symbol" w:hint="default"/>
+        <w:sz w:val="20"/>
+      </w:rPr>
+    </w:lvl>
+    <w:lvl w:ilvl="1" w:tentative="1">
+      <w:start w:val="1"/>
+      <w:numFmt w:val="bullet"/>
+      <w:lvlText w:val="o"/>
+      <w:lvlJc w:val="left"/>
+      <w:pPr>
+        <w:tabs>
+          <w:tab w:val="num" w:pos="1440"/>
+        </w:tabs>
+        <w:ind w:left="1440" w:hanging="360"/>
+      </w:pPr>
+      <w:rPr>
+        <w:rFonts w:ascii="Courier New" w:hAnsi="Courier New" w:hint="default"/>
+        <w:sz w:val="20"/>
+      </w:rPr>
+    </w:lvl>
+    <w:lvl w:ilvl="2" w:tentative="1">
+      <w:start w:val="1"/>
+      <w:numFmt w:val="bullet"/>
+      <w:lvlText w:val=""/>
+      <w:lvlJc w:val="left"/>
+      <w:pPr>
+        <w:tabs>
+          <w:tab w:val="num" w:pos="2160"/>
+        </w:tabs>
+        <w:ind w:left="2160" w:hanging="360"/>
+      </w:pPr>
+      <w:rPr>
+        <w:rFonts w:ascii="Wingdings" w:hAnsi="Wingdings" w:hint="default"/>
+        <w:sz w:val="20"/>
+      </w:rPr>
+    </w:lvl>
+    <w:lvl w:ilvl="3" w:tentative="1">
+      <w:start w:val="1"/>
+      <w:numFmt w:val="bullet"/>
+      <w:lvlText w:val=""/>
+      <w:lvlJc w:val="left"/>
+      <w:pPr>
+        <w:tabs>
+          <w:tab w:val="num" w:pos="2880"/>
+        </w:tabs>
+        <w:ind w:left="2880" w:hanging="360"/>
+      </w:pPr>
+      <w:rPr>
+        <w:rFonts w:ascii="Wingdings" w:hAnsi="Wingdings" w:hint="default"/>
+        <w:sz w:val="20"/>
+      </w:rPr>
+    </w:lvl>
+    <w:lvl w:ilvl="4" w:tentative="1">
+      <w:start w:val="1"/>
+      <w:numFmt w:val="bullet"/>
+      <w:lvlText w:val=""/>
+      <w:lvlJc w:val="left"/>
+      <w:pPr>
+        <w:tabs>
+          <w:tab w:val="num" w:pos="3600"/>
+        </w:tabs>
+        <w:ind w:left="3600" w:hanging="360"/>
+      </w:pPr>
+      <w:rPr>
+        <w:rFonts w:ascii="Wingdings" w:hAnsi="Wingdings" w:hint="default"/>
+        <w:sz w:val="20"/>
+      </w:rPr>
+    </w:lvl>
+    <w:lvl w:ilvl="5" w:tentative="1">
+      <w:start w:val="1"/>
+      <w:numFmt w:val="bullet"/>
+      <w:lvlText w:val=""/>
+      <w:lvlJc w:val="left"/>
+      <w:pPr>
+        <w:tabs>
+          <w:tab w:val="num" w:pos="4320"/>
+        </w:tabs>
+        <w:ind w:left="4320" w:hanging="360"/>
+      </w:pPr>
+      <w:rPr>
+        <w:rFonts w:ascii="Wingdings" w:hAnsi="Wingdings" w:hint="default"/>
+        <w:sz w:val="20"/>
+      </w:rPr>
+    </w:lvl>
+    <w:lvl w:ilvl="6" w:tentative="1">
+      <w:start w:val="1"/>
+      <w:numFmt w:val="bullet"/>
+      <w:lvlText w:val=""/>
+      <w:lvlJc w:val="left"/>
+      <w:pPr>
+        <w:tabs>
+          <w:tab w:val="num" w:pos="5040"/>
+        </w:tabs>
+        <w:ind w:left="5040" w:hanging="360"/>
+      </w:pPr>
+      <w:rPr>
+        <w:rFonts w:ascii="Wingdings" w:hAnsi="Wingdings" w:hint="default"/>
+        <w:sz w:val="20"/>
+      </w:rPr>
+    </w:lvl>
+    <w:lvl w:ilvl="7" w:tentative="1">
+      <w:start w:val="1"/>
+      <w:numFmt w:val="bullet"/>
+      <w:lvlText w:val=""/>
+      <w:lvlJc w:val="left"/>
+      <w:pPr>
+        <w:tabs>
+          <w:tab w:val="num" w:pos="5760"/>
+        </w:tabs>
+        <w:ind w:left="5760" w:hanging="360"/>
+      </w:pPr>
+      <w:rPr>
+        <w:rFonts w:ascii="Wingdings" w:hAnsi="Wingdings" w:hint="default"/>
+        <w:sz w:val="20"/>
+      </w:rPr>
+    </w:lvl>
+    <w:lvl w:ilvl="8" w:tentative="1">
+      <w:start w:val="1"/>
+      <w:numFmt w:val="bullet"/>
+      <w:lvlText w:val=""/>
+      <w:lvlJc w:val="left"/>
+      <w:pPr>
+        <w:tabs>
+          <w:tab w:val="num" w:pos="6480"/>
+        </w:tabs>
+        <w:ind w:left="6480" w:hanging="360"/>
+      </w:pPr>
+      <w:rPr>
+        <w:rFonts w:ascii="Wingdings" w:hAnsi="Wingdings" w:hint="default"/>
+        <w:sz w:val="20"/>
+      </w:rPr>
+    </w:lvl>
+  </w:abstractNum>
+  <w:abstractNum w:abstractNumId="27" w15:restartNumberingAfterBreak="0">
     <w:nsid w:val="3CEA12FD"/>
     <w:multiLevelType w:val="multilevel"/>
     <w:tmpl w:val="470E4E08"/>
@@ -4269,7 +5419,7 @@
       </w:pPr>
     </w:lvl>
   </w:abstractNum>
-  <w:abstractNum w:abstractNumId="21" w15:restartNumberingAfterBreak="0">
+  <w:abstractNum w:abstractNumId="28" w15:restartNumberingAfterBreak="0">
     <w:nsid w:val="41243560"/>
     <w:multiLevelType w:val="multilevel"/>
     <w:tmpl w:val="D728D408"/>
@@ -4418,7 +5568,901 @@
       </w:rPr>
     </w:lvl>
   </w:abstractNum>
-  <w:abstractNum w:abstractNumId="22" w15:restartNumberingAfterBreak="0">
+  <w:abstractNum w:abstractNumId="29" w15:restartNumberingAfterBreak="0">
+    <w:nsid w:val="475D7FB6"/>
+    <w:multiLevelType w:val="multilevel"/>
+    <w:tmpl w:val="A06E0D42"/>
+    <w:lvl w:ilvl="0">
+      <w:start w:val="1"/>
+      <w:numFmt w:val="bullet"/>
+      <w:lvlText w:val=""/>
+      <w:lvlJc w:val="left"/>
+      <w:pPr>
+        <w:tabs>
+          <w:tab w:val="num" w:pos="720"/>
+        </w:tabs>
+        <w:ind w:left="720" w:hanging="360"/>
+      </w:pPr>
+      <w:rPr>
+        <w:rFonts w:ascii="Symbol" w:hAnsi="Symbol" w:hint="default"/>
+        <w:sz w:val="20"/>
+      </w:rPr>
+    </w:lvl>
+    <w:lvl w:ilvl="1" w:tentative="1">
+      <w:start w:val="1"/>
+      <w:numFmt w:val="bullet"/>
+      <w:lvlText w:val="o"/>
+      <w:lvlJc w:val="left"/>
+      <w:pPr>
+        <w:tabs>
+          <w:tab w:val="num" w:pos="1440"/>
+        </w:tabs>
+        <w:ind w:left="1440" w:hanging="360"/>
+      </w:pPr>
+      <w:rPr>
+        <w:rFonts w:ascii="Courier New" w:hAnsi="Courier New" w:hint="default"/>
+        <w:sz w:val="20"/>
+      </w:rPr>
+    </w:lvl>
+    <w:lvl w:ilvl="2" w:tentative="1">
+      <w:start w:val="1"/>
+      <w:numFmt w:val="bullet"/>
+      <w:lvlText w:val=""/>
+      <w:lvlJc w:val="left"/>
+      <w:pPr>
+        <w:tabs>
+          <w:tab w:val="num" w:pos="2160"/>
+        </w:tabs>
+        <w:ind w:left="2160" w:hanging="360"/>
+      </w:pPr>
+      <w:rPr>
+        <w:rFonts w:ascii="Wingdings" w:hAnsi="Wingdings" w:hint="default"/>
+        <w:sz w:val="20"/>
+      </w:rPr>
+    </w:lvl>
+    <w:lvl w:ilvl="3" w:tentative="1">
+      <w:start w:val="1"/>
+      <w:numFmt w:val="bullet"/>
+      <w:lvlText w:val=""/>
+      <w:lvlJc w:val="left"/>
+      <w:pPr>
+        <w:tabs>
+          <w:tab w:val="num" w:pos="2880"/>
+        </w:tabs>
+        <w:ind w:left="2880" w:hanging="360"/>
+      </w:pPr>
+      <w:rPr>
+        <w:rFonts w:ascii="Wingdings" w:hAnsi="Wingdings" w:hint="default"/>
+        <w:sz w:val="20"/>
+      </w:rPr>
+    </w:lvl>
+    <w:lvl w:ilvl="4" w:tentative="1">
+      <w:start w:val="1"/>
+      <w:numFmt w:val="bullet"/>
+      <w:lvlText w:val=""/>
+      <w:lvlJc w:val="left"/>
+      <w:pPr>
+        <w:tabs>
+          <w:tab w:val="num" w:pos="3600"/>
+        </w:tabs>
+        <w:ind w:left="3600" w:hanging="360"/>
+      </w:pPr>
+      <w:rPr>
+        <w:rFonts w:ascii="Wingdings" w:hAnsi="Wingdings" w:hint="default"/>
+        <w:sz w:val="20"/>
+      </w:rPr>
+    </w:lvl>
+    <w:lvl w:ilvl="5" w:tentative="1">
+      <w:start w:val="1"/>
+      <w:numFmt w:val="bullet"/>
+      <w:lvlText w:val=""/>
+      <w:lvlJc w:val="left"/>
+      <w:pPr>
+        <w:tabs>
+          <w:tab w:val="num" w:pos="4320"/>
+        </w:tabs>
+        <w:ind w:left="4320" w:hanging="360"/>
+      </w:pPr>
+      <w:rPr>
+        <w:rFonts w:ascii="Wingdings" w:hAnsi="Wingdings" w:hint="default"/>
+        <w:sz w:val="20"/>
+      </w:rPr>
+    </w:lvl>
+    <w:lvl w:ilvl="6" w:tentative="1">
+      <w:start w:val="1"/>
+      <w:numFmt w:val="bullet"/>
+      <w:lvlText w:val=""/>
+      <w:lvlJc w:val="left"/>
+      <w:pPr>
+        <w:tabs>
+          <w:tab w:val="num" w:pos="5040"/>
+        </w:tabs>
+        <w:ind w:left="5040" w:hanging="360"/>
+      </w:pPr>
+      <w:rPr>
+        <w:rFonts w:ascii="Wingdings" w:hAnsi="Wingdings" w:hint="default"/>
+        <w:sz w:val="20"/>
+      </w:rPr>
+    </w:lvl>
+    <w:lvl w:ilvl="7" w:tentative="1">
+      <w:start w:val="1"/>
+      <w:numFmt w:val="bullet"/>
+      <w:lvlText w:val=""/>
+      <w:lvlJc w:val="left"/>
+      <w:pPr>
+        <w:tabs>
+          <w:tab w:val="num" w:pos="5760"/>
+        </w:tabs>
+        <w:ind w:left="5760" w:hanging="360"/>
+      </w:pPr>
+      <w:rPr>
+        <w:rFonts w:ascii="Wingdings" w:hAnsi="Wingdings" w:hint="default"/>
+        <w:sz w:val="20"/>
+      </w:rPr>
+    </w:lvl>
+    <w:lvl w:ilvl="8" w:tentative="1">
+      <w:start w:val="1"/>
+      <w:numFmt w:val="bullet"/>
+      <w:lvlText w:val=""/>
+      <w:lvlJc w:val="left"/>
+      <w:pPr>
+        <w:tabs>
+          <w:tab w:val="num" w:pos="6480"/>
+        </w:tabs>
+        <w:ind w:left="6480" w:hanging="360"/>
+      </w:pPr>
+      <w:rPr>
+        <w:rFonts w:ascii="Wingdings" w:hAnsi="Wingdings" w:hint="default"/>
+        <w:sz w:val="20"/>
+      </w:rPr>
+    </w:lvl>
+  </w:abstractNum>
+  <w:abstractNum w:abstractNumId="30" w15:restartNumberingAfterBreak="0">
+    <w:nsid w:val="492C5FB3"/>
+    <w:multiLevelType w:val="multilevel"/>
+    <w:tmpl w:val="319E0280"/>
+    <w:lvl w:ilvl="0">
+      <w:start w:val="1"/>
+      <w:numFmt w:val="bullet"/>
+      <w:lvlText w:val=""/>
+      <w:lvlJc w:val="left"/>
+      <w:pPr>
+        <w:tabs>
+          <w:tab w:val="num" w:pos="720"/>
+        </w:tabs>
+        <w:ind w:left="720" w:hanging="360"/>
+      </w:pPr>
+      <w:rPr>
+        <w:rFonts w:ascii="Symbol" w:hAnsi="Symbol" w:hint="default"/>
+        <w:sz w:val="20"/>
+      </w:rPr>
+    </w:lvl>
+    <w:lvl w:ilvl="1" w:tentative="1">
+      <w:start w:val="1"/>
+      <w:numFmt w:val="bullet"/>
+      <w:lvlText w:val="o"/>
+      <w:lvlJc w:val="left"/>
+      <w:pPr>
+        <w:tabs>
+          <w:tab w:val="num" w:pos="1440"/>
+        </w:tabs>
+        <w:ind w:left="1440" w:hanging="360"/>
+      </w:pPr>
+      <w:rPr>
+        <w:rFonts w:ascii="Courier New" w:hAnsi="Courier New" w:hint="default"/>
+        <w:sz w:val="20"/>
+      </w:rPr>
+    </w:lvl>
+    <w:lvl w:ilvl="2" w:tentative="1">
+      <w:start w:val="1"/>
+      <w:numFmt w:val="bullet"/>
+      <w:lvlText w:val=""/>
+      <w:lvlJc w:val="left"/>
+      <w:pPr>
+        <w:tabs>
+          <w:tab w:val="num" w:pos="2160"/>
+        </w:tabs>
+        <w:ind w:left="2160" w:hanging="360"/>
+      </w:pPr>
+      <w:rPr>
+        <w:rFonts w:ascii="Wingdings" w:hAnsi="Wingdings" w:hint="default"/>
+        <w:sz w:val="20"/>
+      </w:rPr>
+    </w:lvl>
+    <w:lvl w:ilvl="3" w:tentative="1">
+      <w:start w:val="1"/>
+      <w:numFmt w:val="bullet"/>
+      <w:lvlText w:val=""/>
+      <w:lvlJc w:val="left"/>
+      <w:pPr>
+        <w:tabs>
+          <w:tab w:val="num" w:pos="2880"/>
+        </w:tabs>
+        <w:ind w:left="2880" w:hanging="360"/>
+      </w:pPr>
+      <w:rPr>
+        <w:rFonts w:ascii="Wingdings" w:hAnsi="Wingdings" w:hint="default"/>
+        <w:sz w:val="20"/>
+      </w:rPr>
+    </w:lvl>
+    <w:lvl w:ilvl="4" w:tentative="1">
+      <w:start w:val="1"/>
+      <w:numFmt w:val="bullet"/>
+      <w:lvlText w:val=""/>
+      <w:lvlJc w:val="left"/>
+      <w:pPr>
+        <w:tabs>
+          <w:tab w:val="num" w:pos="3600"/>
+        </w:tabs>
+        <w:ind w:left="3600" w:hanging="360"/>
+      </w:pPr>
+      <w:rPr>
+        <w:rFonts w:ascii="Wingdings" w:hAnsi="Wingdings" w:hint="default"/>
+        <w:sz w:val="20"/>
+      </w:rPr>
+    </w:lvl>
+    <w:lvl w:ilvl="5" w:tentative="1">
+      <w:start w:val="1"/>
+      <w:numFmt w:val="bullet"/>
+      <w:lvlText w:val=""/>
+      <w:lvlJc w:val="left"/>
+      <w:pPr>
+        <w:tabs>
+          <w:tab w:val="num" w:pos="4320"/>
+        </w:tabs>
+        <w:ind w:left="4320" w:hanging="360"/>
+      </w:pPr>
+      <w:rPr>
+        <w:rFonts w:ascii="Wingdings" w:hAnsi="Wingdings" w:hint="default"/>
+        <w:sz w:val="20"/>
+      </w:rPr>
+    </w:lvl>
+    <w:lvl w:ilvl="6" w:tentative="1">
+      <w:start w:val="1"/>
+      <w:numFmt w:val="bullet"/>
+      <w:lvlText w:val=""/>
+      <w:lvlJc w:val="left"/>
+      <w:pPr>
+        <w:tabs>
+          <w:tab w:val="num" w:pos="5040"/>
+        </w:tabs>
+        <w:ind w:left="5040" w:hanging="360"/>
+      </w:pPr>
+      <w:rPr>
+        <w:rFonts w:ascii="Wingdings" w:hAnsi="Wingdings" w:hint="default"/>
+        <w:sz w:val="20"/>
+      </w:rPr>
+    </w:lvl>
+    <w:lvl w:ilvl="7" w:tentative="1">
+      <w:start w:val="1"/>
+      <w:numFmt w:val="bullet"/>
+      <w:lvlText w:val=""/>
+      <w:lvlJc w:val="left"/>
+      <w:pPr>
+        <w:tabs>
+          <w:tab w:val="num" w:pos="5760"/>
+        </w:tabs>
+        <w:ind w:left="5760" w:hanging="360"/>
+      </w:pPr>
+      <w:rPr>
+        <w:rFonts w:ascii="Wingdings" w:hAnsi="Wingdings" w:hint="default"/>
+        <w:sz w:val="20"/>
+      </w:rPr>
+    </w:lvl>
+    <w:lvl w:ilvl="8" w:tentative="1">
+      <w:start w:val="1"/>
+      <w:numFmt w:val="bullet"/>
+      <w:lvlText w:val=""/>
+      <w:lvlJc w:val="left"/>
+      <w:pPr>
+        <w:tabs>
+          <w:tab w:val="num" w:pos="6480"/>
+        </w:tabs>
+        <w:ind w:left="6480" w:hanging="360"/>
+      </w:pPr>
+      <w:rPr>
+        <w:rFonts w:ascii="Wingdings" w:hAnsi="Wingdings" w:hint="default"/>
+        <w:sz w:val="20"/>
+      </w:rPr>
+    </w:lvl>
+  </w:abstractNum>
+  <w:abstractNum w:abstractNumId="31" w15:restartNumberingAfterBreak="0">
+    <w:nsid w:val="4CD134AF"/>
+    <w:multiLevelType w:val="multilevel"/>
+    <w:tmpl w:val="C8B8CF92"/>
+    <w:lvl w:ilvl="0">
+      <w:start w:val="1"/>
+      <w:numFmt w:val="bullet"/>
+      <w:lvlText w:val=""/>
+      <w:lvlJc w:val="left"/>
+      <w:pPr>
+        <w:tabs>
+          <w:tab w:val="num" w:pos="720"/>
+        </w:tabs>
+        <w:ind w:left="720" w:hanging="360"/>
+      </w:pPr>
+      <w:rPr>
+        <w:rFonts w:ascii="Symbol" w:hAnsi="Symbol" w:hint="default"/>
+        <w:sz w:val="20"/>
+      </w:rPr>
+    </w:lvl>
+    <w:lvl w:ilvl="1" w:tentative="1">
+      <w:start w:val="1"/>
+      <w:numFmt w:val="bullet"/>
+      <w:lvlText w:val="o"/>
+      <w:lvlJc w:val="left"/>
+      <w:pPr>
+        <w:tabs>
+          <w:tab w:val="num" w:pos="1440"/>
+        </w:tabs>
+        <w:ind w:left="1440" w:hanging="360"/>
+      </w:pPr>
+      <w:rPr>
+        <w:rFonts w:ascii="Courier New" w:hAnsi="Courier New" w:hint="default"/>
+        <w:sz w:val="20"/>
+      </w:rPr>
+    </w:lvl>
+    <w:lvl w:ilvl="2" w:tentative="1">
+      <w:start w:val="1"/>
+      <w:numFmt w:val="bullet"/>
+      <w:lvlText w:val=""/>
+      <w:lvlJc w:val="left"/>
+      <w:pPr>
+        <w:tabs>
+          <w:tab w:val="num" w:pos="2160"/>
+        </w:tabs>
+        <w:ind w:left="2160" w:hanging="360"/>
+      </w:pPr>
+      <w:rPr>
+        <w:rFonts w:ascii="Wingdings" w:hAnsi="Wingdings" w:hint="default"/>
+        <w:sz w:val="20"/>
+      </w:rPr>
+    </w:lvl>
+    <w:lvl w:ilvl="3" w:tentative="1">
+      <w:start w:val="1"/>
+      <w:numFmt w:val="bullet"/>
+      <w:lvlText w:val=""/>
+      <w:lvlJc w:val="left"/>
+      <w:pPr>
+        <w:tabs>
+          <w:tab w:val="num" w:pos="2880"/>
+        </w:tabs>
+        <w:ind w:left="2880" w:hanging="360"/>
+      </w:pPr>
+      <w:rPr>
+        <w:rFonts w:ascii="Wingdings" w:hAnsi="Wingdings" w:hint="default"/>
+        <w:sz w:val="20"/>
+      </w:rPr>
+    </w:lvl>
+    <w:lvl w:ilvl="4" w:tentative="1">
+      <w:start w:val="1"/>
+      <w:numFmt w:val="bullet"/>
+      <w:lvlText w:val=""/>
+      <w:lvlJc w:val="left"/>
+      <w:pPr>
+        <w:tabs>
+          <w:tab w:val="num" w:pos="3600"/>
+        </w:tabs>
+        <w:ind w:left="3600" w:hanging="360"/>
+      </w:pPr>
+      <w:rPr>
+        <w:rFonts w:ascii="Wingdings" w:hAnsi="Wingdings" w:hint="default"/>
+        <w:sz w:val="20"/>
+      </w:rPr>
+    </w:lvl>
+    <w:lvl w:ilvl="5" w:tentative="1">
+      <w:start w:val="1"/>
+      <w:numFmt w:val="bullet"/>
+      <w:lvlText w:val=""/>
+      <w:lvlJc w:val="left"/>
+      <w:pPr>
+        <w:tabs>
+          <w:tab w:val="num" w:pos="4320"/>
+        </w:tabs>
+        <w:ind w:left="4320" w:hanging="360"/>
+      </w:pPr>
+      <w:rPr>
+        <w:rFonts w:ascii="Wingdings" w:hAnsi="Wingdings" w:hint="default"/>
+        <w:sz w:val="20"/>
+      </w:rPr>
+    </w:lvl>
+    <w:lvl w:ilvl="6" w:tentative="1">
+      <w:start w:val="1"/>
+      <w:numFmt w:val="bullet"/>
+      <w:lvlText w:val=""/>
+      <w:lvlJc w:val="left"/>
+      <w:pPr>
+        <w:tabs>
+          <w:tab w:val="num" w:pos="5040"/>
+        </w:tabs>
+        <w:ind w:left="5040" w:hanging="360"/>
+      </w:pPr>
+      <w:rPr>
+        <w:rFonts w:ascii="Wingdings" w:hAnsi="Wingdings" w:hint="default"/>
+        <w:sz w:val="20"/>
+      </w:rPr>
+    </w:lvl>
+    <w:lvl w:ilvl="7" w:tentative="1">
+      <w:start w:val="1"/>
+      <w:numFmt w:val="bullet"/>
+      <w:lvlText w:val=""/>
+      <w:lvlJc w:val="left"/>
+      <w:pPr>
+        <w:tabs>
+          <w:tab w:val="num" w:pos="5760"/>
+        </w:tabs>
+        <w:ind w:left="5760" w:hanging="360"/>
+      </w:pPr>
+      <w:rPr>
+        <w:rFonts w:ascii="Wingdings" w:hAnsi="Wingdings" w:hint="default"/>
+        <w:sz w:val="20"/>
+      </w:rPr>
+    </w:lvl>
+    <w:lvl w:ilvl="8" w:tentative="1">
+      <w:start w:val="1"/>
+      <w:numFmt w:val="bullet"/>
+      <w:lvlText w:val=""/>
+      <w:lvlJc w:val="left"/>
+      <w:pPr>
+        <w:tabs>
+          <w:tab w:val="num" w:pos="6480"/>
+        </w:tabs>
+        <w:ind w:left="6480" w:hanging="360"/>
+      </w:pPr>
+      <w:rPr>
+        <w:rFonts w:ascii="Wingdings" w:hAnsi="Wingdings" w:hint="default"/>
+        <w:sz w:val="20"/>
+      </w:rPr>
+    </w:lvl>
+  </w:abstractNum>
+  <w:abstractNum w:abstractNumId="32" w15:restartNumberingAfterBreak="0">
+    <w:nsid w:val="50C85C2C"/>
+    <w:multiLevelType w:val="multilevel"/>
+    <w:tmpl w:val="93B86870"/>
+    <w:lvl w:ilvl="0">
+      <w:start w:val="1"/>
+      <w:numFmt w:val="bullet"/>
+      <w:lvlText w:val=""/>
+      <w:lvlJc w:val="left"/>
+      <w:pPr>
+        <w:tabs>
+          <w:tab w:val="num" w:pos="720"/>
+        </w:tabs>
+        <w:ind w:left="720" w:hanging="360"/>
+      </w:pPr>
+      <w:rPr>
+        <w:rFonts w:ascii="Symbol" w:hAnsi="Symbol" w:hint="default"/>
+        <w:sz w:val="20"/>
+      </w:rPr>
+    </w:lvl>
+    <w:lvl w:ilvl="1" w:tentative="1">
+      <w:start w:val="1"/>
+      <w:numFmt w:val="bullet"/>
+      <w:lvlText w:val="o"/>
+      <w:lvlJc w:val="left"/>
+      <w:pPr>
+        <w:tabs>
+          <w:tab w:val="num" w:pos="1440"/>
+        </w:tabs>
+        <w:ind w:left="1440" w:hanging="360"/>
+      </w:pPr>
+      <w:rPr>
+        <w:rFonts w:ascii="Courier New" w:hAnsi="Courier New" w:hint="default"/>
+        <w:sz w:val="20"/>
+      </w:rPr>
+    </w:lvl>
+    <w:lvl w:ilvl="2" w:tentative="1">
+      <w:start w:val="1"/>
+      <w:numFmt w:val="bullet"/>
+      <w:lvlText w:val=""/>
+      <w:lvlJc w:val="left"/>
+      <w:pPr>
+        <w:tabs>
+          <w:tab w:val="num" w:pos="2160"/>
+        </w:tabs>
+        <w:ind w:left="2160" w:hanging="360"/>
+      </w:pPr>
+      <w:rPr>
+        <w:rFonts w:ascii="Wingdings" w:hAnsi="Wingdings" w:hint="default"/>
+        <w:sz w:val="20"/>
+      </w:rPr>
+    </w:lvl>
+    <w:lvl w:ilvl="3" w:tentative="1">
+      <w:start w:val="1"/>
+      <w:numFmt w:val="bullet"/>
+      <w:lvlText w:val=""/>
+      <w:lvlJc w:val="left"/>
+      <w:pPr>
+        <w:tabs>
+          <w:tab w:val="num" w:pos="2880"/>
+        </w:tabs>
+        <w:ind w:left="2880" w:hanging="360"/>
+      </w:pPr>
+      <w:rPr>
+        <w:rFonts w:ascii="Wingdings" w:hAnsi="Wingdings" w:hint="default"/>
+        <w:sz w:val="20"/>
+      </w:rPr>
+    </w:lvl>
+    <w:lvl w:ilvl="4" w:tentative="1">
+      <w:start w:val="1"/>
+      <w:numFmt w:val="bullet"/>
+      <w:lvlText w:val=""/>
+      <w:lvlJc w:val="left"/>
+      <w:pPr>
+        <w:tabs>
+          <w:tab w:val="num" w:pos="3600"/>
+        </w:tabs>
+        <w:ind w:left="3600" w:hanging="360"/>
+      </w:pPr>
+      <w:rPr>
+        <w:rFonts w:ascii="Wingdings" w:hAnsi="Wingdings" w:hint="default"/>
+        <w:sz w:val="20"/>
+      </w:rPr>
+    </w:lvl>
+    <w:lvl w:ilvl="5" w:tentative="1">
+      <w:start w:val="1"/>
+      <w:numFmt w:val="bullet"/>
+      <w:lvlText w:val=""/>
+      <w:lvlJc w:val="left"/>
+      <w:pPr>
+        <w:tabs>
+          <w:tab w:val="num" w:pos="4320"/>
+        </w:tabs>
+        <w:ind w:left="4320" w:hanging="360"/>
+      </w:pPr>
+      <w:rPr>
+        <w:rFonts w:ascii="Wingdings" w:hAnsi="Wingdings" w:hint="default"/>
+        <w:sz w:val="20"/>
+      </w:rPr>
+    </w:lvl>
+    <w:lvl w:ilvl="6" w:tentative="1">
+      <w:start w:val="1"/>
+      <w:numFmt w:val="bullet"/>
+      <w:lvlText w:val=""/>
+      <w:lvlJc w:val="left"/>
+      <w:pPr>
+        <w:tabs>
+          <w:tab w:val="num" w:pos="5040"/>
+        </w:tabs>
+        <w:ind w:left="5040" w:hanging="360"/>
+      </w:pPr>
+      <w:rPr>
+        <w:rFonts w:ascii="Wingdings" w:hAnsi="Wingdings" w:hint="default"/>
+        <w:sz w:val="20"/>
+      </w:rPr>
+    </w:lvl>
+    <w:lvl w:ilvl="7" w:tentative="1">
+      <w:start w:val="1"/>
+      <w:numFmt w:val="bullet"/>
+      <w:lvlText w:val=""/>
+      <w:lvlJc w:val="left"/>
+      <w:pPr>
+        <w:tabs>
+          <w:tab w:val="num" w:pos="5760"/>
+        </w:tabs>
+        <w:ind w:left="5760" w:hanging="360"/>
+      </w:pPr>
+      <w:rPr>
+        <w:rFonts w:ascii="Wingdings" w:hAnsi="Wingdings" w:hint="default"/>
+        <w:sz w:val="20"/>
+      </w:rPr>
+    </w:lvl>
+    <w:lvl w:ilvl="8" w:tentative="1">
+      <w:start w:val="1"/>
+      <w:numFmt w:val="bullet"/>
+      <w:lvlText w:val=""/>
+      <w:lvlJc w:val="left"/>
+      <w:pPr>
+        <w:tabs>
+          <w:tab w:val="num" w:pos="6480"/>
+        </w:tabs>
+        <w:ind w:left="6480" w:hanging="360"/>
+      </w:pPr>
+      <w:rPr>
+        <w:rFonts w:ascii="Wingdings" w:hAnsi="Wingdings" w:hint="default"/>
+        <w:sz w:val="20"/>
+      </w:rPr>
+    </w:lvl>
+  </w:abstractNum>
+  <w:abstractNum w:abstractNumId="33" w15:restartNumberingAfterBreak="0">
+    <w:nsid w:val="56B400BE"/>
+    <w:multiLevelType w:val="multilevel"/>
+    <w:tmpl w:val="68D64468"/>
+    <w:lvl w:ilvl="0">
+      <w:start w:val="1"/>
+      <w:numFmt w:val="bullet"/>
+      <w:lvlText w:val=""/>
+      <w:lvlJc w:val="left"/>
+      <w:pPr>
+        <w:tabs>
+          <w:tab w:val="num" w:pos="720"/>
+        </w:tabs>
+        <w:ind w:left="720" w:hanging="360"/>
+      </w:pPr>
+      <w:rPr>
+        <w:rFonts w:ascii="Symbol" w:hAnsi="Symbol" w:hint="default"/>
+        <w:sz w:val="20"/>
+      </w:rPr>
+    </w:lvl>
+    <w:lvl w:ilvl="1" w:tentative="1">
+      <w:start w:val="1"/>
+      <w:numFmt w:val="bullet"/>
+      <w:lvlText w:val="o"/>
+      <w:lvlJc w:val="left"/>
+      <w:pPr>
+        <w:tabs>
+          <w:tab w:val="num" w:pos="1440"/>
+        </w:tabs>
+        <w:ind w:left="1440" w:hanging="360"/>
+      </w:pPr>
+      <w:rPr>
+        <w:rFonts w:ascii="Courier New" w:hAnsi="Courier New" w:hint="default"/>
+        <w:sz w:val="20"/>
+      </w:rPr>
+    </w:lvl>
+    <w:lvl w:ilvl="2" w:tentative="1">
+      <w:start w:val="1"/>
+      <w:numFmt w:val="bullet"/>
+      <w:lvlText w:val=""/>
+      <w:lvlJc w:val="left"/>
+      <w:pPr>
+        <w:tabs>
+          <w:tab w:val="num" w:pos="2160"/>
+        </w:tabs>
+        <w:ind w:left="2160" w:hanging="360"/>
+      </w:pPr>
+      <w:rPr>
+        <w:rFonts w:ascii="Wingdings" w:hAnsi="Wingdings" w:hint="default"/>
+        <w:sz w:val="20"/>
+      </w:rPr>
+    </w:lvl>
+    <w:lvl w:ilvl="3" w:tentative="1">
+      <w:start w:val="1"/>
+      <w:numFmt w:val="bullet"/>
+      <w:lvlText w:val=""/>
+      <w:lvlJc w:val="left"/>
+      <w:pPr>
+        <w:tabs>
+          <w:tab w:val="num" w:pos="2880"/>
+        </w:tabs>
+        <w:ind w:left="2880" w:hanging="360"/>
+      </w:pPr>
+      <w:rPr>
+        <w:rFonts w:ascii="Wingdings" w:hAnsi="Wingdings" w:hint="default"/>
+        <w:sz w:val="20"/>
+      </w:rPr>
+    </w:lvl>
+    <w:lvl w:ilvl="4" w:tentative="1">
+      <w:start w:val="1"/>
+      <w:numFmt w:val="bullet"/>
+      <w:lvlText w:val=""/>
+      <w:lvlJc w:val="left"/>
+      <w:pPr>
+        <w:tabs>
+          <w:tab w:val="num" w:pos="3600"/>
+        </w:tabs>
+        <w:ind w:left="3600" w:hanging="360"/>
+      </w:pPr>
+      <w:rPr>
+        <w:rFonts w:ascii="Wingdings" w:hAnsi="Wingdings" w:hint="default"/>
+        <w:sz w:val="20"/>
+      </w:rPr>
+    </w:lvl>
+    <w:lvl w:ilvl="5" w:tentative="1">
+      <w:start w:val="1"/>
+      <w:numFmt w:val="bullet"/>
+      <w:lvlText w:val=""/>
+      <w:lvlJc w:val="left"/>
+      <w:pPr>
+        <w:tabs>
+          <w:tab w:val="num" w:pos="4320"/>
+        </w:tabs>
+        <w:ind w:left="4320" w:hanging="360"/>
+      </w:pPr>
+      <w:rPr>
+        <w:rFonts w:ascii="Wingdings" w:hAnsi="Wingdings" w:hint="default"/>
+        <w:sz w:val="20"/>
+      </w:rPr>
+    </w:lvl>
+    <w:lvl w:ilvl="6" w:tentative="1">
+      <w:start w:val="1"/>
+      <w:numFmt w:val="bullet"/>
+      <w:lvlText w:val=""/>
+      <w:lvlJc w:val="left"/>
+      <w:pPr>
+        <w:tabs>
+          <w:tab w:val="num" w:pos="5040"/>
+        </w:tabs>
+        <w:ind w:left="5040" w:hanging="360"/>
+      </w:pPr>
+      <w:rPr>
+        <w:rFonts w:ascii="Wingdings" w:hAnsi="Wingdings" w:hint="default"/>
+        <w:sz w:val="20"/>
+      </w:rPr>
+    </w:lvl>
+    <w:lvl w:ilvl="7" w:tentative="1">
+      <w:start w:val="1"/>
+      <w:numFmt w:val="bullet"/>
+      <w:lvlText w:val=""/>
+      <w:lvlJc w:val="left"/>
+      <w:pPr>
+        <w:tabs>
+          <w:tab w:val="num" w:pos="5760"/>
+        </w:tabs>
+        <w:ind w:left="5760" w:hanging="360"/>
+      </w:pPr>
+      <w:rPr>
+        <w:rFonts w:ascii="Wingdings" w:hAnsi="Wingdings" w:hint="default"/>
+        <w:sz w:val="20"/>
+      </w:rPr>
+    </w:lvl>
+    <w:lvl w:ilvl="8" w:tentative="1">
+      <w:start w:val="1"/>
+      <w:numFmt w:val="bullet"/>
+      <w:lvlText w:val=""/>
+      <w:lvlJc w:val="left"/>
+      <w:pPr>
+        <w:tabs>
+          <w:tab w:val="num" w:pos="6480"/>
+        </w:tabs>
+        <w:ind w:left="6480" w:hanging="360"/>
+      </w:pPr>
+      <w:rPr>
+        <w:rFonts w:ascii="Wingdings" w:hAnsi="Wingdings" w:hint="default"/>
+        <w:sz w:val="20"/>
+      </w:rPr>
+    </w:lvl>
+  </w:abstractNum>
+  <w:abstractNum w:abstractNumId="34" w15:restartNumberingAfterBreak="0">
+    <w:nsid w:val="56BC3104"/>
+    <w:multiLevelType w:val="multilevel"/>
+    <w:tmpl w:val="2FF2D5EA"/>
+    <w:lvl w:ilvl="0">
+      <w:start w:val="1"/>
+      <w:numFmt w:val="bullet"/>
+      <w:lvlText w:val=""/>
+      <w:lvlJc w:val="left"/>
+      <w:pPr>
+        <w:tabs>
+          <w:tab w:val="num" w:pos="720"/>
+        </w:tabs>
+        <w:ind w:left="720" w:hanging="360"/>
+      </w:pPr>
+      <w:rPr>
+        <w:rFonts w:ascii="Symbol" w:hAnsi="Symbol" w:hint="default"/>
+        <w:sz w:val="20"/>
+      </w:rPr>
+    </w:lvl>
+    <w:lvl w:ilvl="1" w:tentative="1">
+      <w:start w:val="1"/>
+      <w:numFmt w:val="bullet"/>
+      <w:lvlText w:val="o"/>
+      <w:lvlJc w:val="left"/>
+      <w:pPr>
+        <w:tabs>
+          <w:tab w:val="num" w:pos="1440"/>
+        </w:tabs>
+        <w:ind w:left="1440" w:hanging="360"/>
+      </w:pPr>
+      <w:rPr>
+        <w:rFonts w:ascii="Courier New" w:hAnsi="Courier New" w:hint="default"/>
+        <w:sz w:val="20"/>
+      </w:rPr>
+    </w:lvl>
+    <w:lvl w:ilvl="2" w:tentative="1">
+      <w:start w:val="1"/>
+      <w:numFmt w:val="bullet"/>
+      <w:lvlText w:val=""/>
+      <w:lvlJc w:val="left"/>
+      <w:pPr>
+        <w:tabs>
+          <w:tab w:val="num" w:pos="2160"/>
+        </w:tabs>
+        <w:ind w:left="2160" w:hanging="360"/>
+      </w:pPr>
+      <w:rPr>
+        <w:rFonts w:ascii="Wingdings" w:hAnsi="Wingdings" w:hint="default"/>
+        <w:sz w:val="20"/>
+      </w:rPr>
+    </w:lvl>
+    <w:lvl w:ilvl="3" w:tentative="1">
+      <w:start w:val="1"/>
+      <w:numFmt w:val="bullet"/>
+      <w:lvlText w:val=""/>
+      <w:lvlJc w:val="left"/>
+      <w:pPr>
+        <w:tabs>
+          <w:tab w:val="num" w:pos="2880"/>
+        </w:tabs>
+        <w:ind w:left="2880" w:hanging="360"/>
+      </w:pPr>
+      <w:rPr>
+        <w:rFonts w:ascii="Wingdings" w:hAnsi="Wingdings" w:hint="default"/>
+        <w:sz w:val="20"/>
+      </w:rPr>
+    </w:lvl>
+    <w:lvl w:ilvl="4" w:tentative="1">
+      <w:start w:val="1"/>
+      <w:numFmt w:val="bullet"/>
+      <w:lvlText w:val=""/>
+      <w:lvlJc w:val="left"/>
+      <w:pPr>
+        <w:tabs>
+          <w:tab w:val="num" w:pos="3600"/>
+        </w:tabs>
+        <w:ind w:left="3600" w:hanging="360"/>
+      </w:pPr>
+      <w:rPr>
+        <w:rFonts w:ascii="Wingdings" w:hAnsi="Wingdings" w:hint="default"/>
+        <w:sz w:val="20"/>
+      </w:rPr>
+    </w:lvl>
+    <w:lvl w:ilvl="5" w:tentative="1">
+      <w:start w:val="1"/>
+      <w:numFmt w:val="bullet"/>
+      <w:lvlText w:val=""/>
+      <w:lvlJc w:val="left"/>
+      <w:pPr>
+        <w:tabs>
+          <w:tab w:val="num" w:pos="4320"/>
+        </w:tabs>
+        <w:ind w:left="4320" w:hanging="360"/>
+      </w:pPr>
+      <w:rPr>
+        <w:rFonts w:ascii="Wingdings" w:hAnsi="Wingdings" w:hint="default"/>
+        <w:sz w:val="20"/>
+      </w:rPr>
+    </w:lvl>
+    <w:lvl w:ilvl="6" w:tentative="1">
+      <w:start w:val="1"/>
+      <w:numFmt w:val="bullet"/>
+      <w:lvlText w:val=""/>
+      <w:lvlJc w:val="left"/>
+      <w:pPr>
+        <w:tabs>
+          <w:tab w:val="num" w:pos="5040"/>
+        </w:tabs>
+        <w:ind w:left="5040" w:hanging="360"/>
+      </w:pPr>
+      <w:rPr>
+        <w:rFonts w:ascii="Wingdings" w:hAnsi="Wingdings" w:hint="default"/>
+        <w:sz w:val="20"/>
+      </w:rPr>
+    </w:lvl>
+    <w:lvl w:ilvl="7" w:tentative="1">
+      <w:start w:val="1"/>
+      <w:numFmt w:val="bullet"/>
+      <w:lvlText w:val=""/>
+      <w:lvlJc w:val="left"/>
+      <w:pPr>
+        <w:tabs>
+          <w:tab w:val="num" w:pos="5760"/>
+        </w:tabs>
+        <w:ind w:left="5760" w:hanging="360"/>
+      </w:pPr>
+      <w:rPr>
+        <w:rFonts w:ascii="Wingdings" w:hAnsi="Wingdings" w:hint="default"/>
+        <w:sz w:val="20"/>
+      </w:rPr>
+    </w:lvl>
+    <w:lvl w:ilvl="8" w:tentative="1">
+      <w:start w:val="1"/>
+      <w:numFmt w:val="bullet"/>
+      <w:lvlText w:val=""/>
+      <w:lvlJc w:val="left"/>
+      <w:pPr>
+        <w:tabs>
+          <w:tab w:val="num" w:pos="6480"/>
+        </w:tabs>
+        <w:ind w:left="6480" w:hanging="360"/>
+      </w:pPr>
+      <w:rPr>
+        <w:rFonts w:ascii="Wingdings" w:hAnsi="Wingdings" w:hint="default"/>
+        <w:sz w:val="20"/>
+      </w:rPr>
+    </w:lvl>
+  </w:abstractNum>
+  <w:abstractNum w:abstractNumId="35" w15:restartNumberingAfterBreak="0">
     <w:nsid w:val="56E678C0"/>
     <w:multiLevelType w:val="multilevel"/>
     <w:tmpl w:val="84E85780"/>
@@ -4567,7 +6611,7 @@
       </w:rPr>
     </w:lvl>
   </w:abstractNum>
-  <w:abstractNum w:abstractNumId="23" w15:restartNumberingAfterBreak="0">
+  <w:abstractNum w:abstractNumId="36" w15:restartNumberingAfterBreak="0">
     <w:nsid w:val="57C900E2"/>
     <w:multiLevelType w:val="multilevel"/>
     <w:tmpl w:val="0B74DCF0"/>
@@ -4716,7 +6760,7 @@
       </w:rPr>
     </w:lvl>
   </w:abstractNum>
-  <w:abstractNum w:abstractNumId="24" w15:restartNumberingAfterBreak="0">
+  <w:abstractNum w:abstractNumId="37" w15:restartNumberingAfterBreak="0">
     <w:nsid w:val="613E4224"/>
     <w:multiLevelType w:val="hybridMultilevel"/>
     <w:tmpl w:val="2F5E7D2A"/>
@@ -4829,7 +6873,7 @@
       </w:rPr>
     </w:lvl>
   </w:abstractNum>
-  <w:abstractNum w:abstractNumId="25" w15:restartNumberingAfterBreak="0">
+  <w:abstractNum w:abstractNumId="38" w15:restartNumberingAfterBreak="0">
     <w:nsid w:val="634511CD"/>
     <w:multiLevelType w:val="multilevel"/>
     <w:tmpl w:val="46B4DB38"/>
@@ -4978,7 +7022,7 @@
       </w:rPr>
     </w:lvl>
   </w:abstractNum>
-  <w:abstractNum w:abstractNumId="26" w15:restartNumberingAfterBreak="0">
+  <w:abstractNum w:abstractNumId="39" w15:restartNumberingAfterBreak="0">
     <w:nsid w:val="641F50E6"/>
     <w:multiLevelType w:val="multilevel"/>
     <w:tmpl w:val="9C6EC4BC"/>
@@ -5127,7 +7171,7 @@
       </w:rPr>
     </w:lvl>
   </w:abstractNum>
-  <w:abstractNum w:abstractNumId="27" w15:restartNumberingAfterBreak="0">
+  <w:abstractNum w:abstractNumId="40" w15:restartNumberingAfterBreak="0">
     <w:nsid w:val="643874D6"/>
     <w:multiLevelType w:val="multilevel"/>
     <w:tmpl w:val="05FE1FAE"/>
@@ -5276,7 +7320,156 @@
       </w:rPr>
     </w:lvl>
   </w:abstractNum>
-  <w:abstractNum w:abstractNumId="28" w15:restartNumberingAfterBreak="0">
+  <w:abstractNum w:abstractNumId="41" w15:restartNumberingAfterBreak="0">
+    <w:nsid w:val="67BF554D"/>
+    <w:multiLevelType w:val="multilevel"/>
+    <w:tmpl w:val="63DC7306"/>
+    <w:lvl w:ilvl="0">
+      <w:start w:val="1"/>
+      <w:numFmt w:val="bullet"/>
+      <w:lvlText w:val=""/>
+      <w:lvlJc w:val="left"/>
+      <w:pPr>
+        <w:tabs>
+          <w:tab w:val="num" w:pos="720"/>
+        </w:tabs>
+        <w:ind w:left="720" w:hanging="360"/>
+      </w:pPr>
+      <w:rPr>
+        <w:rFonts w:ascii="Symbol" w:hAnsi="Symbol" w:hint="default"/>
+        <w:sz w:val="20"/>
+      </w:rPr>
+    </w:lvl>
+    <w:lvl w:ilvl="1" w:tentative="1">
+      <w:start w:val="1"/>
+      <w:numFmt w:val="bullet"/>
+      <w:lvlText w:val="o"/>
+      <w:lvlJc w:val="left"/>
+      <w:pPr>
+        <w:tabs>
+          <w:tab w:val="num" w:pos="1440"/>
+        </w:tabs>
+        <w:ind w:left="1440" w:hanging="360"/>
+      </w:pPr>
+      <w:rPr>
+        <w:rFonts w:ascii="Courier New" w:hAnsi="Courier New" w:hint="default"/>
+        <w:sz w:val="20"/>
+      </w:rPr>
+    </w:lvl>
+    <w:lvl w:ilvl="2" w:tentative="1">
+      <w:start w:val="1"/>
+      <w:numFmt w:val="bullet"/>
+      <w:lvlText w:val=""/>
+      <w:lvlJc w:val="left"/>
+      <w:pPr>
+        <w:tabs>
+          <w:tab w:val="num" w:pos="2160"/>
+        </w:tabs>
+        <w:ind w:left="2160" w:hanging="360"/>
+      </w:pPr>
+      <w:rPr>
+        <w:rFonts w:ascii="Wingdings" w:hAnsi="Wingdings" w:hint="default"/>
+        <w:sz w:val="20"/>
+      </w:rPr>
+    </w:lvl>
+    <w:lvl w:ilvl="3" w:tentative="1">
+      <w:start w:val="1"/>
+      <w:numFmt w:val="bullet"/>
+      <w:lvlText w:val=""/>
+      <w:lvlJc w:val="left"/>
+      <w:pPr>
+        <w:tabs>
+          <w:tab w:val="num" w:pos="2880"/>
+        </w:tabs>
+        <w:ind w:left="2880" w:hanging="360"/>
+      </w:pPr>
+      <w:rPr>
+        <w:rFonts w:ascii="Wingdings" w:hAnsi="Wingdings" w:hint="default"/>
+        <w:sz w:val="20"/>
+      </w:rPr>
+    </w:lvl>
+    <w:lvl w:ilvl="4" w:tentative="1">
+      <w:start w:val="1"/>
+      <w:numFmt w:val="bullet"/>
+      <w:lvlText w:val=""/>
+      <w:lvlJc w:val="left"/>
+      <w:pPr>
+        <w:tabs>
+          <w:tab w:val="num" w:pos="3600"/>
+        </w:tabs>
+        <w:ind w:left="3600" w:hanging="360"/>
+      </w:pPr>
+      <w:rPr>
+        <w:rFonts w:ascii="Wingdings" w:hAnsi="Wingdings" w:hint="default"/>
+        <w:sz w:val="20"/>
+      </w:rPr>
+    </w:lvl>
+    <w:lvl w:ilvl="5" w:tentative="1">
+      <w:start w:val="1"/>
+      <w:numFmt w:val="bullet"/>
+      <w:lvlText w:val=""/>
+      <w:lvlJc w:val="left"/>
+      <w:pPr>
+        <w:tabs>
+          <w:tab w:val="num" w:pos="4320"/>
+        </w:tabs>
+        <w:ind w:left="4320" w:hanging="360"/>
+      </w:pPr>
+      <w:rPr>
+        <w:rFonts w:ascii="Wingdings" w:hAnsi="Wingdings" w:hint="default"/>
+        <w:sz w:val="20"/>
+      </w:rPr>
+    </w:lvl>
+    <w:lvl w:ilvl="6" w:tentative="1">
+      <w:start w:val="1"/>
+      <w:numFmt w:val="bullet"/>
+      <w:lvlText w:val=""/>
+      <w:lvlJc w:val="left"/>
+      <w:pPr>
+        <w:tabs>
+          <w:tab w:val="num" w:pos="5040"/>
+        </w:tabs>
+        <w:ind w:left="5040" w:hanging="360"/>
+      </w:pPr>
+      <w:rPr>
+        <w:rFonts w:ascii="Wingdings" w:hAnsi="Wingdings" w:hint="default"/>
+        <w:sz w:val="20"/>
+      </w:rPr>
+    </w:lvl>
+    <w:lvl w:ilvl="7" w:tentative="1">
+      <w:start w:val="1"/>
+      <w:numFmt w:val="bullet"/>
+      <w:lvlText w:val=""/>
+      <w:lvlJc w:val="left"/>
+      <w:pPr>
+        <w:tabs>
+          <w:tab w:val="num" w:pos="5760"/>
+        </w:tabs>
+        <w:ind w:left="5760" w:hanging="360"/>
+      </w:pPr>
+      <w:rPr>
+        <w:rFonts w:ascii="Wingdings" w:hAnsi="Wingdings" w:hint="default"/>
+        <w:sz w:val="20"/>
+      </w:rPr>
+    </w:lvl>
+    <w:lvl w:ilvl="8" w:tentative="1">
+      <w:start w:val="1"/>
+      <w:numFmt w:val="bullet"/>
+      <w:lvlText w:val=""/>
+      <w:lvlJc w:val="left"/>
+      <w:pPr>
+        <w:tabs>
+          <w:tab w:val="num" w:pos="6480"/>
+        </w:tabs>
+        <w:ind w:left="6480" w:hanging="360"/>
+      </w:pPr>
+      <w:rPr>
+        <w:rFonts w:ascii="Wingdings" w:hAnsi="Wingdings" w:hint="default"/>
+        <w:sz w:val="20"/>
+      </w:rPr>
+    </w:lvl>
+  </w:abstractNum>
+  <w:abstractNum w:abstractNumId="42" w15:restartNumberingAfterBreak="0">
     <w:nsid w:val="6A6D147E"/>
     <w:multiLevelType w:val="multilevel"/>
     <w:tmpl w:val="B6D81D6A"/>
@@ -5425,7 +7618,7 @@
       </w:rPr>
     </w:lvl>
   </w:abstractNum>
-  <w:abstractNum w:abstractNumId="29" w15:restartNumberingAfterBreak="0">
+  <w:abstractNum w:abstractNumId="43" w15:restartNumberingAfterBreak="0">
     <w:nsid w:val="6B6A0CCA"/>
     <w:multiLevelType w:val="multilevel"/>
     <w:tmpl w:val="B2F01F9A"/>
@@ -5574,7 +7767,156 @@
       </w:rPr>
     </w:lvl>
   </w:abstractNum>
-  <w:abstractNum w:abstractNumId="30" w15:restartNumberingAfterBreak="0">
+  <w:abstractNum w:abstractNumId="44" w15:restartNumberingAfterBreak="0">
+    <w:nsid w:val="6D34340D"/>
+    <w:multiLevelType w:val="multilevel"/>
+    <w:tmpl w:val="2C5A02A6"/>
+    <w:lvl w:ilvl="0">
+      <w:start w:val="1"/>
+      <w:numFmt w:val="bullet"/>
+      <w:lvlText w:val=""/>
+      <w:lvlJc w:val="left"/>
+      <w:pPr>
+        <w:tabs>
+          <w:tab w:val="num" w:pos="720"/>
+        </w:tabs>
+        <w:ind w:left="720" w:hanging="360"/>
+      </w:pPr>
+      <w:rPr>
+        <w:rFonts w:ascii="Symbol" w:hAnsi="Symbol" w:hint="default"/>
+        <w:sz w:val="20"/>
+      </w:rPr>
+    </w:lvl>
+    <w:lvl w:ilvl="1" w:tentative="1">
+      <w:start w:val="1"/>
+      <w:numFmt w:val="bullet"/>
+      <w:lvlText w:val="o"/>
+      <w:lvlJc w:val="left"/>
+      <w:pPr>
+        <w:tabs>
+          <w:tab w:val="num" w:pos="1440"/>
+        </w:tabs>
+        <w:ind w:left="1440" w:hanging="360"/>
+      </w:pPr>
+      <w:rPr>
+        <w:rFonts w:ascii="Courier New" w:hAnsi="Courier New" w:hint="default"/>
+        <w:sz w:val="20"/>
+      </w:rPr>
+    </w:lvl>
+    <w:lvl w:ilvl="2" w:tentative="1">
+      <w:start w:val="1"/>
+      <w:numFmt w:val="bullet"/>
+      <w:lvlText w:val=""/>
+      <w:lvlJc w:val="left"/>
+      <w:pPr>
+        <w:tabs>
+          <w:tab w:val="num" w:pos="2160"/>
+        </w:tabs>
+        <w:ind w:left="2160" w:hanging="360"/>
+      </w:pPr>
+      <w:rPr>
+        <w:rFonts w:ascii="Wingdings" w:hAnsi="Wingdings" w:hint="default"/>
+        <w:sz w:val="20"/>
+      </w:rPr>
+    </w:lvl>
+    <w:lvl w:ilvl="3" w:tentative="1">
+      <w:start w:val="1"/>
+      <w:numFmt w:val="bullet"/>
+      <w:lvlText w:val=""/>
+      <w:lvlJc w:val="left"/>
+      <w:pPr>
+        <w:tabs>
+          <w:tab w:val="num" w:pos="2880"/>
+        </w:tabs>
+        <w:ind w:left="2880" w:hanging="360"/>
+      </w:pPr>
+      <w:rPr>
+        <w:rFonts w:ascii="Wingdings" w:hAnsi="Wingdings" w:hint="default"/>
+        <w:sz w:val="20"/>
+      </w:rPr>
+    </w:lvl>
+    <w:lvl w:ilvl="4" w:tentative="1">
+      <w:start w:val="1"/>
+      <w:numFmt w:val="bullet"/>
+      <w:lvlText w:val=""/>
+      <w:lvlJc w:val="left"/>
+      <w:pPr>
+        <w:tabs>
+          <w:tab w:val="num" w:pos="3600"/>
+        </w:tabs>
+        <w:ind w:left="3600" w:hanging="360"/>
+      </w:pPr>
+      <w:rPr>
+        <w:rFonts w:ascii="Wingdings" w:hAnsi="Wingdings" w:hint="default"/>
+        <w:sz w:val="20"/>
+      </w:rPr>
+    </w:lvl>
+    <w:lvl w:ilvl="5" w:tentative="1">
+      <w:start w:val="1"/>
+      <w:numFmt w:val="bullet"/>
+      <w:lvlText w:val=""/>
+      <w:lvlJc w:val="left"/>
+      <w:pPr>
+        <w:tabs>
+          <w:tab w:val="num" w:pos="4320"/>
+        </w:tabs>
+        <w:ind w:left="4320" w:hanging="360"/>
+      </w:pPr>
+      <w:rPr>
+        <w:rFonts w:ascii="Wingdings" w:hAnsi="Wingdings" w:hint="default"/>
+        <w:sz w:val="20"/>
+      </w:rPr>
+    </w:lvl>
+    <w:lvl w:ilvl="6" w:tentative="1">
+      <w:start w:val="1"/>
+      <w:numFmt w:val="bullet"/>
+      <w:lvlText w:val=""/>
+      <w:lvlJc w:val="left"/>
+      <w:pPr>
+        <w:tabs>
+          <w:tab w:val="num" w:pos="5040"/>
+        </w:tabs>
+        <w:ind w:left="5040" w:hanging="360"/>
+      </w:pPr>
+      <w:rPr>
+        <w:rFonts w:ascii="Wingdings" w:hAnsi="Wingdings" w:hint="default"/>
+        <w:sz w:val="20"/>
+      </w:rPr>
+    </w:lvl>
+    <w:lvl w:ilvl="7" w:tentative="1">
+      <w:start w:val="1"/>
+      <w:numFmt w:val="bullet"/>
+      <w:lvlText w:val=""/>
+      <w:lvlJc w:val="left"/>
+      <w:pPr>
+        <w:tabs>
+          <w:tab w:val="num" w:pos="5760"/>
+        </w:tabs>
+        <w:ind w:left="5760" w:hanging="360"/>
+      </w:pPr>
+      <w:rPr>
+        <w:rFonts w:ascii="Wingdings" w:hAnsi="Wingdings" w:hint="default"/>
+        <w:sz w:val="20"/>
+      </w:rPr>
+    </w:lvl>
+    <w:lvl w:ilvl="8" w:tentative="1">
+      <w:start w:val="1"/>
+      <w:numFmt w:val="bullet"/>
+      <w:lvlText w:val=""/>
+      <w:lvlJc w:val="left"/>
+      <w:pPr>
+        <w:tabs>
+          <w:tab w:val="num" w:pos="6480"/>
+        </w:tabs>
+        <w:ind w:left="6480" w:hanging="360"/>
+      </w:pPr>
+      <w:rPr>
+        <w:rFonts w:ascii="Wingdings" w:hAnsi="Wingdings" w:hint="default"/>
+        <w:sz w:val="20"/>
+      </w:rPr>
+    </w:lvl>
+  </w:abstractNum>
+  <w:abstractNum w:abstractNumId="45" w15:restartNumberingAfterBreak="0">
     <w:nsid w:val="70E84B52"/>
     <w:multiLevelType w:val="multilevel"/>
     <w:tmpl w:val="7904F5E4"/>
@@ -5723,7 +8065,7 @@
       </w:rPr>
     </w:lvl>
   </w:abstractNum>
-  <w:abstractNum w:abstractNumId="31" w15:restartNumberingAfterBreak="0">
+  <w:abstractNum w:abstractNumId="46" w15:restartNumberingAfterBreak="0">
     <w:nsid w:val="729C2AA1"/>
     <w:multiLevelType w:val="multilevel"/>
     <w:tmpl w:val="55A86244"/>
@@ -5872,7 +8214,156 @@
       </w:rPr>
     </w:lvl>
   </w:abstractNum>
-  <w:abstractNum w:abstractNumId="32" w15:restartNumberingAfterBreak="0">
+  <w:abstractNum w:abstractNumId="47" w15:restartNumberingAfterBreak="0">
+    <w:nsid w:val="756D357B"/>
+    <w:multiLevelType w:val="multilevel"/>
+    <w:tmpl w:val="BBCE7E12"/>
+    <w:lvl w:ilvl="0">
+      <w:start w:val="1"/>
+      <w:numFmt w:val="bullet"/>
+      <w:lvlText w:val=""/>
+      <w:lvlJc w:val="left"/>
+      <w:pPr>
+        <w:tabs>
+          <w:tab w:val="num" w:pos="720"/>
+        </w:tabs>
+        <w:ind w:left="720" w:hanging="360"/>
+      </w:pPr>
+      <w:rPr>
+        <w:rFonts w:ascii="Symbol" w:hAnsi="Symbol" w:hint="default"/>
+        <w:sz w:val="20"/>
+      </w:rPr>
+    </w:lvl>
+    <w:lvl w:ilvl="1" w:tentative="1">
+      <w:start w:val="1"/>
+      <w:numFmt w:val="bullet"/>
+      <w:lvlText w:val="o"/>
+      <w:lvlJc w:val="left"/>
+      <w:pPr>
+        <w:tabs>
+          <w:tab w:val="num" w:pos="1440"/>
+        </w:tabs>
+        <w:ind w:left="1440" w:hanging="360"/>
+      </w:pPr>
+      <w:rPr>
+        <w:rFonts w:ascii="Courier New" w:hAnsi="Courier New" w:hint="default"/>
+        <w:sz w:val="20"/>
+      </w:rPr>
+    </w:lvl>
+    <w:lvl w:ilvl="2" w:tentative="1">
+      <w:start w:val="1"/>
+      <w:numFmt w:val="bullet"/>
+      <w:lvlText w:val=""/>
+      <w:lvlJc w:val="left"/>
+      <w:pPr>
+        <w:tabs>
+          <w:tab w:val="num" w:pos="2160"/>
+        </w:tabs>
+        <w:ind w:left="2160" w:hanging="360"/>
+      </w:pPr>
+      <w:rPr>
+        <w:rFonts w:ascii="Wingdings" w:hAnsi="Wingdings" w:hint="default"/>
+        <w:sz w:val="20"/>
+      </w:rPr>
+    </w:lvl>
+    <w:lvl w:ilvl="3" w:tentative="1">
+      <w:start w:val="1"/>
+      <w:numFmt w:val="bullet"/>
+      <w:lvlText w:val=""/>
+      <w:lvlJc w:val="left"/>
+      <w:pPr>
+        <w:tabs>
+          <w:tab w:val="num" w:pos="2880"/>
+        </w:tabs>
+        <w:ind w:left="2880" w:hanging="360"/>
+      </w:pPr>
+      <w:rPr>
+        <w:rFonts w:ascii="Wingdings" w:hAnsi="Wingdings" w:hint="default"/>
+        <w:sz w:val="20"/>
+      </w:rPr>
+    </w:lvl>
+    <w:lvl w:ilvl="4" w:tentative="1">
+      <w:start w:val="1"/>
+      <w:numFmt w:val="bullet"/>
+      <w:lvlText w:val=""/>
+      <w:lvlJc w:val="left"/>
+      <w:pPr>
+        <w:tabs>
+          <w:tab w:val="num" w:pos="3600"/>
+        </w:tabs>
+        <w:ind w:left="3600" w:hanging="360"/>
+      </w:pPr>
+      <w:rPr>
+        <w:rFonts w:ascii="Wingdings" w:hAnsi="Wingdings" w:hint="default"/>
+        <w:sz w:val="20"/>
+      </w:rPr>
+    </w:lvl>
+    <w:lvl w:ilvl="5" w:tentative="1">
+      <w:start w:val="1"/>
+      <w:numFmt w:val="bullet"/>
+      <w:lvlText w:val=""/>
+      <w:lvlJc w:val="left"/>
+      <w:pPr>
+        <w:tabs>
+          <w:tab w:val="num" w:pos="4320"/>
+        </w:tabs>
+        <w:ind w:left="4320" w:hanging="360"/>
+      </w:pPr>
+      <w:rPr>
+        <w:rFonts w:ascii="Wingdings" w:hAnsi="Wingdings" w:hint="default"/>
+        <w:sz w:val="20"/>
+      </w:rPr>
+    </w:lvl>
+    <w:lvl w:ilvl="6" w:tentative="1">
+      <w:start w:val="1"/>
+      <w:numFmt w:val="bullet"/>
+      <w:lvlText w:val=""/>
+      <w:lvlJc w:val="left"/>
+      <w:pPr>
+        <w:tabs>
+          <w:tab w:val="num" w:pos="5040"/>
+        </w:tabs>
+        <w:ind w:left="5040" w:hanging="360"/>
+      </w:pPr>
+      <w:rPr>
+        <w:rFonts w:ascii="Wingdings" w:hAnsi="Wingdings" w:hint="default"/>
+        <w:sz w:val="20"/>
+      </w:rPr>
+    </w:lvl>
+    <w:lvl w:ilvl="7" w:tentative="1">
+      <w:start w:val="1"/>
+      <w:numFmt w:val="bullet"/>
+      <w:lvlText w:val=""/>
+      <w:lvlJc w:val="left"/>
+      <w:pPr>
+        <w:tabs>
+          <w:tab w:val="num" w:pos="5760"/>
+        </w:tabs>
+        <w:ind w:left="5760" w:hanging="360"/>
+      </w:pPr>
+      <w:rPr>
+        <w:rFonts w:ascii="Wingdings" w:hAnsi="Wingdings" w:hint="default"/>
+        <w:sz w:val="20"/>
+      </w:rPr>
+    </w:lvl>
+    <w:lvl w:ilvl="8" w:tentative="1">
+      <w:start w:val="1"/>
+      <w:numFmt w:val="bullet"/>
+      <w:lvlText w:val=""/>
+      <w:lvlJc w:val="left"/>
+      <w:pPr>
+        <w:tabs>
+          <w:tab w:val="num" w:pos="6480"/>
+        </w:tabs>
+        <w:ind w:left="6480" w:hanging="360"/>
+      </w:pPr>
+      <w:rPr>
+        <w:rFonts w:ascii="Wingdings" w:hAnsi="Wingdings" w:hint="default"/>
+        <w:sz w:val="20"/>
+      </w:rPr>
+    </w:lvl>
+  </w:abstractNum>
+  <w:abstractNum w:abstractNumId="48" w15:restartNumberingAfterBreak="0">
     <w:nsid w:val="759E07FC"/>
     <w:multiLevelType w:val="multilevel"/>
     <w:tmpl w:val="200E196A"/>
@@ -6022,103 +8513,151 @@
     </w:lvl>
   </w:abstractNum>
   <w:num w:numId="1" w16cid:durableId="1964270311">
+    <w:abstractNumId w:val="19"/>
+  </w:num>
+  <w:num w:numId="2" w16cid:durableId="515389334">
+    <w:abstractNumId w:val="4"/>
+  </w:num>
+  <w:num w:numId="3" w16cid:durableId="1739398261">
+    <w:abstractNumId w:val="28"/>
+  </w:num>
+  <w:num w:numId="4" w16cid:durableId="808127736">
+    <w:abstractNumId w:val="46"/>
+  </w:num>
+  <w:num w:numId="5" w16cid:durableId="151528639">
+    <w:abstractNumId w:val="23"/>
+  </w:num>
+  <w:num w:numId="6" w16cid:durableId="2092726499">
+    <w:abstractNumId w:val="39"/>
+  </w:num>
+  <w:num w:numId="7" w16cid:durableId="1698122877">
+    <w:abstractNumId w:val="42"/>
+  </w:num>
+  <w:num w:numId="8" w16cid:durableId="1924144104">
+    <w:abstractNumId w:val="6"/>
+  </w:num>
+  <w:num w:numId="9" w16cid:durableId="2055151227">
+    <w:abstractNumId w:val="22"/>
+  </w:num>
+  <w:num w:numId="10" w16cid:durableId="642002673">
+    <w:abstractNumId w:val="10"/>
+  </w:num>
+  <w:num w:numId="11" w16cid:durableId="1582638025">
+    <w:abstractNumId w:val="14"/>
+  </w:num>
+  <w:num w:numId="12" w16cid:durableId="1130680">
+    <w:abstractNumId w:val="12"/>
+  </w:num>
+  <w:num w:numId="13" w16cid:durableId="2019431178">
+    <w:abstractNumId w:val="3"/>
+  </w:num>
+  <w:num w:numId="14" w16cid:durableId="2119444998">
     <w:abstractNumId w:val="15"/>
   </w:num>
-  <w:num w:numId="2" w16cid:durableId="515389334">
-    <w:abstractNumId w:val="3"/>
-  </w:num>
-  <w:num w:numId="3" w16cid:durableId="1739398261">
-    <w:abstractNumId w:val="21"/>
-  </w:num>
-  <w:num w:numId="4" w16cid:durableId="808127736">
-    <w:abstractNumId w:val="31"/>
-  </w:num>
-  <w:num w:numId="5" w16cid:durableId="151528639">
-    <w:abstractNumId w:val="17"/>
-  </w:num>
-  <w:num w:numId="6" w16cid:durableId="2092726499">
-    <w:abstractNumId w:val="26"/>
-  </w:num>
-  <w:num w:numId="7" w16cid:durableId="1698122877">
-    <w:abstractNumId w:val="28"/>
-  </w:num>
-  <w:num w:numId="8" w16cid:durableId="1924144104">
-    <w:abstractNumId w:val="5"/>
-  </w:num>
-  <w:num w:numId="9" w16cid:durableId="2055151227">
-    <w:abstractNumId w:val="16"/>
-  </w:num>
-  <w:num w:numId="10" w16cid:durableId="642002673">
-    <w:abstractNumId w:val="9"/>
-  </w:num>
-  <w:num w:numId="11" w16cid:durableId="1582638025">
-    <w:abstractNumId w:val="13"/>
-  </w:num>
-  <w:num w:numId="12" w16cid:durableId="1130680">
-    <w:abstractNumId w:val="11"/>
-  </w:num>
-  <w:num w:numId="13" w16cid:durableId="2019431178">
-    <w:abstractNumId w:val="2"/>
-  </w:num>
-  <w:num w:numId="14" w16cid:durableId="2119444998">
-    <w:abstractNumId w:val="14"/>
-  </w:num>
   <w:num w:numId="15" w16cid:durableId="548031612">
-    <w:abstractNumId w:val="22"/>
+    <w:abstractNumId w:val="35"/>
   </w:num>
   <w:num w:numId="16" w16cid:durableId="605163162">
-    <w:abstractNumId w:val="24"/>
+    <w:abstractNumId w:val="37"/>
   </w:num>
   <w:num w:numId="17" w16cid:durableId="835922417">
-    <w:abstractNumId w:val="19"/>
+    <w:abstractNumId w:val="25"/>
   </w:num>
   <w:num w:numId="18" w16cid:durableId="1609775481">
-    <w:abstractNumId w:val="29"/>
+    <w:abstractNumId w:val="43"/>
   </w:num>
   <w:num w:numId="19" w16cid:durableId="705182126">
-    <w:abstractNumId w:val="4"/>
+    <w:abstractNumId w:val="5"/>
   </w:num>
   <w:num w:numId="20" w16cid:durableId="1782720675">
     <w:abstractNumId w:val="0"/>
   </w:num>
   <w:num w:numId="21" w16cid:durableId="500002305">
+    <w:abstractNumId w:val="24"/>
+  </w:num>
+  <w:num w:numId="22" w16cid:durableId="910771934">
+    <w:abstractNumId w:val="38"/>
+  </w:num>
+  <w:num w:numId="23" w16cid:durableId="1846286844">
+    <w:abstractNumId w:val="45"/>
+  </w:num>
+  <w:num w:numId="24" w16cid:durableId="1989824594">
+    <w:abstractNumId w:val="11"/>
+  </w:num>
+  <w:num w:numId="25" w16cid:durableId="954824203">
+    <w:abstractNumId w:val="7"/>
+  </w:num>
+  <w:num w:numId="26" w16cid:durableId="1537235560">
+    <w:abstractNumId w:val="40"/>
+  </w:num>
+  <w:num w:numId="27" w16cid:durableId="2071609390">
+    <w:abstractNumId w:val="8"/>
+  </w:num>
+  <w:num w:numId="28" w16cid:durableId="589196032">
+    <w:abstractNumId w:val="48"/>
+  </w:num>
+  <w:num w:numId="29" w16cid:durableId="665938624">
+    <w:abstractNumId w:val="13"/>
+  </w:num>
+  <w:num w:numId="30" w16cid:durableId="863791155">
+    <w:abstractNumId w:val="2"/>
+  </w:num>
+  <w:num w:numId="31" w16cid:durableId="2056733980">
+    <w:abstractNumId w:val="27"/>
+  </w:num>
+  <w:num w:numId="32" w16cid:durableId="20862142">
+    <w:abstractNumId w:val="9"/>
+  </w:num>
+  <w:num w:numId="33" w16cid:durableId="1380786350">
+    <w:abstractNumId w:val="36"/>
+  </w:num>
+  <w:num w:numId="34" w16cid:durableId="2022468863">
+    <w:abstractNumId w:val="44"/>
+  </w:num>
+  <w:num w:numId="35" w16cid:durableId="643237335">
+    <w:abstractNumId w:val="26"/>
+  </w:num>
+  <w:num w:numId="36" w16cid:durableId="1653094414">
+    <w:abstractNumId w:val="21"/>
+  </w:num>
+  <w:num w:numId="37" w16cid:durableId="1964731854">
+    <w:abstractNumId w:val="16"/>
+  </w:num>
+  <w:num w:numId="38" w16cid:durableId="2004047171">
+    <w:abstractNumId w:val="34"/>
+  </w:num>
+  <w:num w:numId="39" w16cid:durableId="1483885061">
     <w:abstractNumId w:val="18"/>
   </w:num>
-  <w:num w:numId="22" w16cid:durableId="910771934">
-    <w:abstractNumId w:val="25"/>
+  <w:num w:numId="40" w16cid:durableId="1887335570">
+    <w:abstractNumId w:val="47"/>
   </w:num>
-  <w:num w:numId="23" w16cid:durableId="1846286844">
+  <w:num w:numId="41" w16cid:durableId="446434479">
     <w:abstractNumId w:val="30"/>
   </w:num>
-  <w:num w:numId="24" w16cid:durableId="1989824594">
-    <w:abstractNumId w:val="10"/>
-  </w:num>
-  <w:num w:numId="25" w16cid:durableId="954824203">
-    <w:abstractNumId w:val="6"/>
-  </w:num>
-  <w:num w:numId="26" w16cid:durableId="1537235560">
-    <w:abstractNumId w:val="27"/>
-  </w:num>
-  <w:num w:numId="27" w16cid:durableId="2071609390">
-    <w:abstractNumId w:val="7"/>
-  </w:num>
-  <w:num w:numId="28" w16cid:durableId="589196032">
+  <w:num w:numId="42" w16cid:durableId="408386475">
     <w:abstractNumId w:val="32"/>
   </w:num>
-  <w:num w:numId="29" w16cid:durableId="665938624">
-    <w:abstractNumId w:val="12"/>
-  </w:num>
-  <w:num w:numId="30" w16cid:durableId="863791155">
-    <w:abstractNumId w:val="1"/>
-  </w:num>
-  <w:num w:numId="31" w16cid:durableId="2056733980">
+  <w:num w:numId="43" w16cid:durableId="1132551135">
     <w:abstractNumId w:val="20"/>
   </w:num>
-  <w:num w:numId="32" w16cid:durableId="20862142">
-    <w:abstractNumId w:val="8"/>
+  <w:num w:numId="44" w16cid:durableId="1661614773">
+    <w:abstractNumId w:val="31"/>
   </w:num>
-  <w:num w:numId="33" w16cid:durableId="1380786350">
-    <w:abstractNumId w:val="23"/>
+  <w:num w:numId="45" w16cid:durableId="592977996">
+    <w:abstractNumId w:val="41"/>
+  </w:num>
+  <w:num w:numId="46" w16cid:durableId="2079093094">
+    <w:abstractNumId w:val="29"/>
+  </w:num>
+  <w:num w:numId="47" w16cid:durableId="285934910">
+    <w:abstractNumId w:val="17"/>
+  </w:num>
+  <w:num w:numId="48" w16cid:durableId="1435855502">
+    <w:abstractNumId w:val="33"/>
+  </w:num>
+  <w:num w:numId="49" w16cid:durableId="1099444975">
+    <w:abstractNumId w:val="1"/>
   </w:num>
 </w:numbering>
 </file>

</xml_diff>